<commit_message>
Aponta para o repositório RenesFernandes7366/api-alunos
</commit_message>
<xml_diff>
--- a/docs/Documentacao_API_Escola.docx
+++ b/docs/Documentacao_API_Escola.docx
@@ -151,7 +151,7 @@
         <w:rPr>
           <w:rFonts w:eastAsia="Arial" w:cs="Arial"/>
         </w:rPr>
-        <w:t>https://github.com/SEU_USUARIO/api-alunos-cursos</w:t>
+        <w:t>https://github.com/RenesFernandes7366/api-alunos</w:t>
       </w:r>
     </w:p>
     <w:p>
@@ -238,7 +238,7 @@
             </w:rPr>
             <w:fldChar w:fldCharType="separate"/>
           </w:r>
-          <w:hyperlink w:anchor="__RefHeading___Toc1169_411353692">
+          <w:hyperlink w:anchor="__RefHeading___Toc1169_3379194974">
             <w:r>
               <w:rPr>
                 <w:rStyle w:val="IndexLink"/>
@@ -258,7 +258,7 @@
             </w:tabs>
             <w:rPr/>
           </w:pPr>
-          <w:hyperlink w:anchor="__RefHeading___Toc1171_411353692">
+          <w:hyperlink w:anchor="__RefHeading___Toc1171_3379194974">
             <w:r>
               <w:rPr>
                 <w:rStyle w:val="IndexLink"/>
@@ -278,7 +278,7 @@
             </w:tabs>
             <w:rPr/>
           </w:pPr>
-          <w:hyperlink w:anchor="__RefHeading___Toc1173_411353692">
+          <w:hyperlink w:anchor="__RefHeading___Toc1173_3379194974">
             <w:r>
               <w:rPr>
                 <w:rStyle w:val="IndexLink"/>
@@ -298,7 +298,7 @@
             </w:tabs>
             <w:rPr/>
           </w:pPr>
-          <w:hyperlink w:anchor="__RefHeading___Toc1175_411353692">
+          <w:hyperlink w:anchor="__RefHeading___Toc1175_3379194974">
             <w:r>
               <w:rPr>
                 <w:rStyle w:val="IndexLink"/>
@@ -318,7 +318,7 @@
             </w:tabs>
             <w:rPr/>
           </w:pPr>
-          <w:hyperlink w:anchor="__RefHeading___Toc1177_411353692">
+          <w:hyperlink w:anchor="__RefHeading___Toc1177_3379194974">
             <w:r>
               <w:rPr>
                 <w:rStyle w:val="IndexLink"/>
@@ -338,7 +338,7 @@
             </w:tabs>
             <w:rPr/>
           </w:pPr>
-          <w:hyperlink w:anchor="__RefHeading___Toc1179_411353692">
+          <w:hyperlink w:anchor="__RefHeading___Toc1179_3379194974">
             <w:r>
               <w:rPr>
                 <w:rStyle w:val="IndexLink"/>
@@ -358,7 +358,7 @@
             </w:tabs>
             <w:rPr/>
           </w:pPr>
-          <w:hyperlink w:anchor="__RefHeading___Toc1181_411353692">
+          <w:hyperlink w:anchor="__RefHeading___Toc1181_3379194974">
             <w:r>
               <w:rPr>
                 <w:rStyle w:val="IndexLink"/>
@@ -378,7 +378,7 @@
             </w:tabs>
             <w:rPr/>
           </w:pPr>
-          <w:hyperlink w:anchor="__RefHeading___Toc1183_411353692">
+          <w:hyperlink w:anchor="__RefHeading___Toc1183_3379194974">
             <w:r>
               <w:rPr>
                 <w:rStyle w:val="IndexLink"/>
@@ -398,7 +398,7 @@
             </w:tabs>
             <w:rPr/>
           </w:pPr>
-          <w:hyperlink w:anchor="__RefHeading___Toc1185_411353692">
+          <w:hyperlink w:anchor="__RefHeading___Toc1185_3379194974">
             <w:r>
               <w:rPr>
                 <w:rStyle w:val="IndexLink"/>
@@ -418,7 +418,7 @@
             </w:tabs>
             <w:rPr/>
           </w:pPr>
-          <w:hyperlink w:anchor="__RefHeading___Toc1187_411353692">
+          <w:hyperlink w:anchor="__RefHeading___Toc1187_3379194974">
             <w:r>
               <w:rPr>
                 <w:rStyle w:val="IndexLink"/>
@@ -438,7 +438,7 @@
             </w:tabs>
             <w:rPr/>
           </w:pPr>
-          <w:hyperlink w:anchor="__RefHeading___Toc1189_411353692">
+          <w:hyperlink w:anchor="__RefHeading___Toc1189_3379194974">
             <w:r>
               <w:rPr>
                 <w:rStyle w:val="IndexLink"/>
@@ -458,7 +458,7 @@
             </w:tabs>
             <w:rPr/>
           </w:pPr>
-          <w:hyperlink w:anchor="__RefHeading___Toc1191_411353692">
+          <w:hyperlink w:anchor="__RefHeading___Toc1191_3379194974">
             <w:r>
               <w:rPr>
                 <w:rStyle w:val="IndexLink"/>
@@ -478,7 +478,7 @@
             </w:tabs>
             <w:rPr/>
           </w:pPr>
-          <w:hyperlink w:anchor="__RefHeading___Toc1193_411353692">
+          <w:hyperlink w:anchor="__RefHeading___Toc1193_3379194974">
             <w:r>
               <w:rPr>
                 <w:rStyle w:val="IndexLink"/>
@@ -498,7 +498,7 @@
             </w:tabs>
             <w:rPr/>
           </w:pPr>
-          <w:hyperlink w:anchor="__RefHeading___Toc1195_411353692">
+          <w:hyperlink w:anchor="__RefHeading___Toc1195_3379194974">
             <w:r>
               <w:rPr>
                 <w:rStyle w:val="IndexLink"/>
@@ -518,7 +518,7 @@
             </w:tabs>
             <w:rPr/>
           </w:pPr>
-          <w:hyperlink w:anchor="__RefHeading___Toc1197_411353692">
+          <w:hyperlink w:anchor="__RefHeading___Toc1197_3379194974">
             <w:r>
               <w:rPr>
                 <w:rStyle w:val="IndexLink"/>
@@ -538,7 +538,7 @@
             </w:tabs>
             <w:rPr/>
           </w:pPr>
-          <w:hyperlink w:anchor="__RefHeading___Toc1199_411353692">
+          <w:hyperlink w:anchor="__RefHeading___Toc1199_3379194974">
             <w:r>
               <w:rPr>
                 <w:rStyle w:val="IndexLink"/>
@@ -558,7 +558,7 @@
             </w:tabs>
             <w:rPr/>
           </w:pPr>
-          <w:hyperlink w:anchor="__RefHeading___Toc1201_411353692">
+          <w:hyperlink w:anchor="__RefHeading___Toc1201_3379194974">
             <w:r>
               <w:rPr>
                 <w:rStyle w:val="IndexLink"/>
@@ -578,7 +578,7 @@
             </w:tabs>
             <w:rPr/>
           </w:pPr>
-          <w:hyperlink w:anchor="__RefHeading___Toc1203_411353692">
+          <w:hyperlink w:anchor="__RefHeading___Toc1203_3379194974">
             <w:r>
               <w:rPr>
                 <w:rStyle w:val="IndexLink"/>
@@ -598,7 +598,7 @@
             </w:tabs>
             <w:rPr/>
           </w:pPr>
-          <w:hyperlink w:anchor="__RefHeading___Toc1205_411353692">
+          <w:hyperlink w:anchor="__RefHeading___Toc1205_3379194974">
             <w:r>
               <w:rPr>
                 <w:rStyle w:val="IndexLink"/>
@@ -618,7 +618,7 @@
             </w:tabs>
             <w:rPr/>
           </w:pPr>
-          <w:hyperlink w:anchor="__RefHeading___Toc1207_411353692">
+          <w:hyperlink w:anchor="__RefHeading___Toc1207_3379194974">
             <w:r>
               <w:rPr>
                 <w:rStyle w:val="IndexLink"/>
@@ -638,7 +638,7 @@
             </w:tabs>
             <w:rPr/>
           </w:pPr>
-          <w:hyperlink w:anchor="__RefHeading___Toc1209_411353692">
+          <w:hyperlink w:anchor="__RefHeading___Toc1209_3379194974">
             <w:r>
               <w:rPr>
                 <w:rStyle w:val="IndexLink"/>
@@ -658,7 +658,7 @@
             </w:tabs>
             <w:rPr/>
           </w:pPr>
-          <w:hyperlink w:anchor="__RefHeading___Toc1211_411353692">
+          <w:hyperlink w:anchor="__RefHeading___Toc1211_3379194974">
             <w:r>
               <w:rPr>
                 <w:rStyle w:val="IndexLink"/>
@@ -678,7 +678,7 @@
             </w:tabs>
             <w:rPr/>
           </w:pPr>
-          <w:hyperlink w:anchor="__RefHeading___Toc1213_411353692">
+          <w:hyperlink w:anchor="__RefHeading___Toc1213_3379194974">
             <w:r>
               <w:rPr>
                 <w:rStyle w:val="IndexLink"/>
@@ -698,7 +698,7 @@
             </w:tabs>
             <w:rPr/>
           </w:pPr>
-          <w:hyperlink w:anchor="__RefHeading___Toc1215_411353692">
+          <w:hyperlink w:anchor="__RefHeading___Toc1215_3379194974">
             <w:r>
               <w:rPr>
                 <w:rStyle w:val="IndexLink"/>
@@ -718,7 +718,7 @@
             </w:tabs>
             <w:rPr/>
           </w:pPr>
-          <w:hyperlink w:anchor="__RefHeading___Toc1217_411353692">
+          <w:hyperlink w:anchor="__RefHeading___Toc1217_3379194974">
             <w:r>
               <w:rPr>
                 <w:rStyle w:val="IndexLink"/>
@@ -738,7 +738,7 @@
             </w:tabs>
             <w:rPr/>
           </w:pPr>
-          <w:hyperlink w:anchor="__RefHeading___Toc1219_411353692">
+          <w:hyperlink w:anchor="__RefHeading___Toc1219_3379194974">
             <w:r>
               <w:rPr>
                 <w:rStyle w:val="IndexLink"/>
@@ -758,7 +758,7 @@
             </w:tabs>
             <w:rPr/>
           </w:pPr>
-          <w:hyperlink w:anchor="__RefHeading___Toc1221_411353692">
+          <w:hyperlink w:anchor="__RefHeading___Toc1221_3379194974">
             <w:r>
               <w:rPr>
                 <w:rStyle w:val="IndexLink"/>
@@ -778,7 +778,7 @@
             </w:tabs>
             <w:rPr/>
           </w:pPr>
-          <w:hyperlink w:anchor="__RefHeading___Toc1223_411353692">
+          <w:hyperlink w:anchor="__RefHeading___Toc1223_3379194974">
             <w:r>
               <w:rPr>
                 <w:rStyle w:val="IndexLink"/>
@@ -798,7 +798,7 @@
             </w:tabs>
             <w:rPr/>
           </w:pPr>
-          <w:hyperlink w:anchor="__RefHeading___Toc1225_411353692">
+          <w:hyperlink w:anchor="__RefHeading___Toc1225_3379194974">
             <w:r>
               <w:rPr>
                 <w:rStyle w:val="IndexLink"/>
@@ -818,7 +818,7 @@
             </w:tabs>
             <w:rPr/>
           </w:pPr>
-          <w:hyperlink w:anchor="__RefHeading___Toc1227_411353692">
+          <w:hyperlink w:anchor="__RefHeading___Toc1227_3379194974">
             <w:r>
               <w:rPr>
                 <w:rStyle w:val="IndexLink"/>
@@ -838,7 +838,7 @@
             </w:tabs>
             <w:rPr/>
           </w:pPr>
-          <w:hyperlink w:anchor="__RefHeading___Toc1229_411353692">
+          <w:hyperlink w:anchor="__RefHeading___Toc1229_3379194974">
             <w:r>
               <w:rPr>
                 <w:rStyle w:val="IndexLink"/>
@@ -858,7 +858,7 @@
             </w:tabs>
             <w:rPr/>
           </w:pPr>
-          <w:hyperlink w:anchor="__RefHeading___Toc1231_411353692">
+          <w:hyperlink w:anchor="__RefHeading___Toc1231_3379194974">
             <w:r>
               <w:rPr>
                 <w:rStyle w:val="IndexLink"/>
@@ -878,7 +878,7 @@
             </w:tabs>
             <w:rPr/>
           </w:pPr>
-          <w:hyperlink w:anchor="__RefHeading___Toc1233_411353692">
+          <w:hyperlink w:anchor="__RefHeading___Toc1233_3379194974">
             <w:r>
               <w:rPr>
                 <w:rStyle w:val="IndexLink"/>
@@ -898,7 +898,7 @@
             </w:tabs>
             <w:rPr/>
           </w:pPr>
-          <w:hyperlink w:anchor="__RefHeading___Toc1235_411353692">
+          <w:hyperlink w:anchor="__RefHeading___Toc1235_3379194974">
             <w:r>
               <w:rPr>
                 <w:rStyle w:val="IndexLink"/>
@@ -918,7 +918,7 @@
             </w:tabs>
             <w:rPr/>
           </w:pPr>
-          <w:hyperlink w:anchor="__RefHeading___Toc1237_411353692">
+          <w:hyperlink w:anchor="__RefHeading___Toc1237_3379194974">
             <w:r>
               <w:rPr>
                 <w:rStyle w:val="IndexLink"/>
@@ -958,7 +958,7 @@
         <w:pStyle w:val="Heading1"/>
         <w:rPr/>
       </w:pPr>
-      <w:bookmarkStart w:id="0" w:name="__RefHeading___Toc1169_411353692"/>
+      <w:bookmarkStart w:id="0" w:name="__RefHeading___Toc1169_3379194974"/>
       <w:bookmarkEnd w:id="0"/>
       <w:r>
         <w:rPr>
@@ -1084,7 +1084,7 @@
         <w:pStyle w:val="Heading2"/>
         <w:rPr/>
       </w:pPr>
-      <w:bookmarkStart w:id="1" w:name="__RefHeading___Toc1171_411353692"/>
+      <w:bookmarkStart w:id="1" w:name="__RefHeading___Toc1171_3379194974"/>
       <w:bookmarkEnd w:id="1"/>
       <w:r>
         <w:rPr>
@@ -1271,7 +1271,7 @@
         <w:pStyle w:val="Heading1"/>
         <w:rPr/>
       </w:pPr>
-      <w:bookmarkStart w:id="2" w:name="__RefHeading___Toc1173_411353692"/>
+      <w:bookmarkStart w:id="2" w:name="__RefHeading___Toc1173_3379194974"/>
       <w:bookmarkEnd w:id="2"/>
       <w:r>
         <w:rPr>
@@ -1462,7 +1462,7 @@
         <w:pStyle w:val="Heading2"/>
         <w:rPr/>
       </w:pPr>
-      <w:bookmarkStart w:id="3" w:name="__RefHeading___Toc1175_411353692"/>
+      <w:bookmarkStart w:id="3" w:name="__RefHeading___Toc1175_3379194974"/>
       <w:bookmarkEnd w:id="3"/>
       <w:r>
         <w:rPr>
@@ -1594,7 +1594,7 @@
         <w:pStyle w:val="Heading1"/>
         <w:rPr/>
       </w:pPr>
-      <w:bookmarkStart w:id="4" w:name="__RefHeading___Toc1177_411353692"/>
+      <w:bookmarkStart w:id="4" w:name="__RefHeading___Toc1177_3379194974"/>
       <w:bookmarkEnd w:id="4"/>
       <w:r>
         <w:rPr>
@@ -2572,7 +2572,7 @@
         <w:pStyle w:val="Heading1"/>
         <w:rPr/>
       </w:pPr>
-      <w:bookmarkStart w:id="5" w:name="__RefHeading___Toc1179_411353692"/>
+      <w:bookmarkStart w:id="5" w:name="__RefHeading___Toc1179_3379194974"/>
       <w:bookmarkEnd w:id="5"/>
       <w:r>
         <w:rPr>
@@ -2658,7 +2658,7 @@
         <w:pStyle w:val="Heading2"/>
         <w:rPr/>
       </w:pPr>
-      <w:bookmarkStart w:id="6" w:name="__RefHeading___Toc1181_411353692"/>
+      <w:bookmarkStart w:id="6" w:name="__RefHeading___Toc1181_3379194974"/>
       <w:bookmarkEnd w:id="6"/>
       <w:r>
         <w:rPr>
@@ -4161,7 +4161,7 @@
         <w:pStyle w:val="Heading2"/>
         <w:rPr/>
       </w:pPr>
-      <w:bookmarkStart w:id="7" w:name="__RefHeading___Toc1183_411353692"/>
+      <w:bookmarkStart w:id="7" w:name="__RefHeading___Toc1183_3379194974"/>
       <w:bookmarkEnd w:id="7"/>
       <w:r>
         <w:rPr>
@@ -4511,7 +4511,7 @@
         <w:pStyle w:val="Heading1"/>
         <w:rPr/>
       </w:pPr>
-      <w:bookmarkStart w:id="8" w:name="__RefHeading___Toc1185_411353692"/>
+      <w:bookmarkStart w:id="8" w:name="__RefHeading___Toc1185_3379194974"/>
       <w:bookmarkEnd w:id="8"/>
       <w:r>
         <w:rPr>
@@ -4525,7 +4525,7 @@
         <w:pStyle w:val="Heading2"/>
         <w:rPr/>
       </w:pPr>
-      <w:bookmarkStart w:id="9" w:name="__RefHeading___Toc1187_411353692"/>
+      <w:bookmarkStart w:id="9" w:name="__RefHeading___Toc1187_3379194974"/>
       <w:bookmarkEnd w:id="9"/>
       <w:r>
         <w:rPr>
@@ -4554,7 +4554,7 @@
           <w:sz w:val="17"/>
           <w:szCs w:val="17"/>
         </w:rPr>
-        <w:t>api-alunos-cursos/</w:t>
+        <w:t>api-alunos/</w:t>
       </w:r>
     </w:p>
     <w:p>
@@ -5156,7 +5156,7 @@
         <w:pStyle w:val="Heading2"/>
         <w:rPr/>
       </w:pPr>
-      <w:bookmarkStart w:id="10" w:name="__RefHeading___Toc1189_411353692"/>
+      <w:bookmarkStart w:id="10" w:name="__RefHeading___Toc1189_3379194974"/>
       <w:bookmarkEnd w:id="10"/>
       <w:r>
         <w:rPr>
@@ -6838,7 +6838,7 @@
         <w:pStyle w:val="Heading2"/>
         <w:rPr/>
       </w:pPr>
-      <w:bookmarkStart w:id="11" w:name="__RefHeading___Toc1191_411353692"/>
+      <w:bookmarkStart w:id="11" w:name="__RefHeading___Toc1191_3379194974"/>
       <w:bookmarkEnd w:id="11"/>
       <w:r>
         <w:rPr>
@@ -7435,7 +7435,7 @@
         <w:pStyle w:val="Heading2"/>
         <w:rPr/>
       </w:pPr>
-      <w:bookmarkStart w:id="12" w:name="__RefHeading___Toc1193_411353692"/>
+      <w:bookmarkStart w:id="12" w:name="__RefHeading___Toc1193_3379194974"/>
       <w:bookmarkEnd w:id="12"/>
       <w:r>
         <w:rPr>
@@ -7557,7 +7557,7 @@
         <w:pStyle w:val="Heading2"/>
         <w:rPr/>
       </w:pPr>
-      <w:bookmarkStart w:id="13" w:name="__RefHeading___Toc1195_411353692"/>
+      <w:bookmarkStart w:id="13" w:name="__RefHeading___Toc1195_3379194974"/>
       <w:bookmarkEnd w:id="13"/>
       <w:r>
         <w:rPr>
@@ -7762,7 +7762,7 @@
         <w:pStyle w:val="Heading1"/>
         <w:rPr/>
       </w:pPr>
-      <w:bookmarkStart w:id="14" w:name="__RefHeading___Toc1197_411353692"/>
+      <w:bookmarkStart w:id="14" w:name="__RefHeading___Toc1197_3379194974"/>
       <w:bookmarkEnd w:id="14"/>
       <w:r>
         <w:rPr>
@@ -7848,7 +7848,7 @@
         <w:pStyle w:val="Heading2"/>
         <w:rPr/>
       </w:pPr>
-      <w:bookmarkStart w:id="15" w:name="__RefHeading___Toc1199_411353692"/>
+      <w:bookmarkStart w:id="15" w:name="__RefHeading___Toc1199_3379194974"/>
       <w:bookmarkEnd w:id="15"/>
       <w:r>
         <w:rPr>
@@ -7963,7 +7963,7 @@
         <w:pStyle w:val="Heading2"/>
         <w:rPr/>
       </w:pPr>
-      <w:bookmarkStart w:id="16" w:name="__RefHeading___Toc1201_411353692"/>
+      <w:bookmarkStart w:id="16" w:name="__RefHeading___Toc1201_3379194974"/>
       <w:bookmarkEnd w:id="16"/>
       <w:r>
         <w:rPr>
@@ -8070,7 +8070,7 @@
         <w:pStyle w:val="Heading2"/>
         <w:rPr/>
       </w:pPr>
-      <w:bookmarkStart w:id="17" w:name="__RefHeading___Toc1203_411353692"/>
+      <w:bookmarkStart w:id="17" w:name="__RefHeading___Toc1203_3379194974"/>
       <w:bookmarkEnd w:id="17"/>
       <w:r>
         <w:rPr>
@@ -8487,7 +8487,7 @@
         <w:pStyle w:val="Heading1"/>
         <w:rPr/>
       </w:pPr>
-      <w:bookmarkStart w:id="18" w:name="__RefHeading___Toc1205_411353692"/>
+      <w:bookmarkStart w:id="18" w:name="__RefHeading___Toc1205_3379194974"/>
       <w:bookmarkEnd w:id="18"/>
       <w:r>
         <w:rPr>
@@ -9508,7 +9508,7 @@
         <w:pStyle w:val="Heading2"/>
         <w:rPr/>
       </w:pPr>
-      <w:bookmarkStart w:id="19" w:name="__RefHeading___Toc1207_411353692"/>
+      <w:bookmarkStart w:id="19" w:name="__RefHeading___Toc1207_3379194974"/>
       <w:bookmarkEnd w:id="19"/>
       <w:r>
         <w:rPr>
@@ -10130,7 +10130,7 @@
         <w:pStyle w:val="Heading2"/>
         <w:rPr/>
       </w:pPr>
-      <w:bookmarkStart w:id="20" w:name="__RefHeading___Toc1209_411353692"/>
+      <w:bookmarkStart w:id="20" w:name="__RefHeading___Toc1209_3379194974"/>
       <w:bookmarkEnd w:id="20"/>
       <w:r>
         <w:rPr>
@@ -10345,7 +10345,7 @@
         <w:pStyle w:val="Heading2"/>
         <w:rPr/>
       </w:pPr>
-      <w:bookmarkStart w:id="21" w:name="__RefHeading___Toc1211_411353692"/>
+      <w:bookmarkStart w:id="21" w:name="__RefHeading___Toc1211_3379194974"/>
       <w:bookmarkEnd w:id="21"/>
       <w:r>
         <w:rPr>
@@ -11037,7 +11037,7 @@
         <w:pStyle w:val="Heading2"/>
         <w:rPr/>
       </w:pPr>
-      <w:bookmarkStart w:id="22" w:name="__RefHeading___Toc1213_411353692"/>
+      <w:bookmarkStart w:id="22" w:name="__RefHeading___Toc1213_3379194974"/>
       <w:bookmarkEnd w:id="22"/>
       <w:r>
         <w:rPr>
@@ -11739,7 +11739,7 @@
         <w:pStyle w:val="Heading1"/>
         <w:rPr/>
       </w:pPr>
-      <w:bookmarkStart w:id="23" w:name="__RefHeading___Toc1215_411353692"/>
+      <w:bookmarkStart w:id="23" w:name="__RefHeading___Toc1215_3379194974"/>
       <w:bookmarkEnd w:id="23"/>
       <w:r>
         <w:rPr>
@@ -11832,7 +11832,7 @@
         <w:pStyle w:val="Heading2"/>
         <w:rPr/>
       </w:pPr>
-      <w:bookmarkStart w:id="24" w:name="__RefHeading___Toc1217_411353692"/>
+      <w:bookmarkStart w:id="24" w:name="__RefHeading___Toc1217_3379194974"/>
       <w:bookmarkEnd w:id="24"/>
       <w:r>
         <w:rPr>
@@ -11861,7 +11861,7 @@
           <w:sz w:val="17"/>
           <w:szCs w:val="17"/>
         </w:rPr>
-        <w:t>git clone https://github.com/SEU_USUARIO/api-alunos-cursos.git</w:t>
+        <w:t>git clone https://github.com/RenesFernandes7366/api-alunos.git</w:t>
       </w:r>
     </w:p>
     <w:p>
@@ -11884,7 +11884,7 @@
           <w:sz w:val="17"/>
           <w:szCs w:val="17"/>
         </w:rPr>
-        <w:t>cd api-alunos-cursos</w:t>
+        <w:t>cd api-alunos</w:t>
       </w:r>
     </w:p>
     <w:p>
@@ -11984,7 +11984,7 @@
         <w:pStyle w:val="Heading2"/>
         <w:rPr/>
       </w:pPr>
-      <w:bookmarkStart w:id="25" w:name="__RefHeading___Toc1219_411353692"/>
+      <w:bookmarkStart w:id="25" w:name="__RefHeading___Toc1219_3379194974"/>
       <w:bookmarkEnd w:id="25"/>
       <w:r>
         <w:rPr>
@@ -12013,7 +12013,7 @@
           <w:sz w:val="17"/>
           <w:szCs w:val="17"/>
         </w:rPr>
-        <w:t># crie um repositório PÚBLICO vazio chamado api-alunos-cursos no GitHub</w:t>
+        <w:t># crie um repositório PÚBLICO vazio chamado api-alunos no GitHub</w:t>
       </w:r>
     </w:p>
     <w:p>
@@ -12036,7 +12036,7 @@
           <w:sz w:val="17"/>
           <w:szCs w:val="17"/>
         </w:rPr>
-        <w:t>git remote add origin https://github.com/SEU_USUARIO/api-alunos-cursos.git</w:t>
+        <w:t>git remote add origin https://github.com/RenesFernandes7366/api-alunos.git</w:t>
       </w:r>
     </w:p>
     <w:p>
@@ -12095,7 +12095,7 @@
         <w:pStyle w:val="Heading2"/>
         <w:rPr/>
       </w:pPr>
-      <w:bookmarkStart w:id="26" w:name="__RefHeading___Toc1221_411353692"/>
+      <w:bookmarkStart w:id="26" w:name="__RefHeading___Toc1221_3379194974"/>
       <w:bookmarkEnd w:id="26"/>
       <w:r>
         <w:rPr>
@@ -12147,7 +12147,7 @@
           <w:sz w:val="17"/>
           <w:szCs w:val="17"/>
         </w:rPr>
-        <w:t>./deploy/azure_criar_vm.sh https://github.com/SEU_USUARIO/api-alunos-cursos.git</w:t>
+        <w:t>./deploy/azure_criar_vm.sh   # usa https://github.com/RenesFernandes7366/api-alunos por padrão</w:t>
       </w:r>
     </w:p>
     <w:p>
@@ -12212,7 +12212,7 @@
         <w:pStyle w:val="Heading2"/>
         <w:rPr/>
       </w:pPr>
-      <w:bookmarkStart w:id="27" w:name="__RefHeading___Toc1223_411353692"/>
+      <w:bookmarkStart w:id="27" w:name="__RefHeading___Toc1223_3379194974"/>
       <w:bookmarkEnd w:id="27"/>
       <w:r>
         <w:rPr>
@@ -12272,7 +12272,7 @@
         <w:pStyle w:val="Heading2"/>
         <w:rPr/>
       </w:pPr>
-      <w:bookmarkStart w:id="28" w:name="__RefHeading___Toc1225_411353692"/>
+      <w:bookmarkStart w:id="28" w:name="__RefHeading___Toc1225_3379194974"/>
       <w:bookmarkEnd w:id="28"/>
       <w:r>
         <w:rPr>
@@ -12404,7 +12404,7 @@
         <w:pStyle w:val="Heading1"/>
         <w:rPr/>
       </w:pPr>
-      <w:bookmarkStart w:id="29" w:name="__RefHeading___Toc1227_411353692"/>
+      <w:bookmarkStart w:id="29" w:name="__RefHeading___Toc1227_3379194974"/>
       <w:bookmarkEnd w:id="29"/>
       <w:r>
         <w:rPr>
@@ -12418,7 +12418,7 @@
         <w:pStyle w:val="Heading2"/>
         <w:rPr/>
       </w:pPr>
-      <w:bookmarkStart w:id="30" w:name="__RefHeading___Toc1229_411353692"/>
+      <w:bookmarkStart w:id="30" w:name="__RefHeading___Toc1229_3379194974"/>
       <w:bookmarkEnd w:id="30"/>
       <w:r>
         <w:rPr>
@@ -12447,7 +12447,7 @@
             <w:rStyle w:val="Hyperlink"/>
             <w:rFonts w:eastAsia="Arial" w:cs="Arial"/>
           </w:rPr>
-          <w:t>https://github.com/SEU_USUARIO/api-alunos-cursos</w:t>
+          <w:t>https://github.com/RenesFernandes7366/api-alunos</w:t>
         </w:r>
       </w:hyperlink>
     </w:p>
@@ -12485,7 +12485,7 @@
         <w:pStyle w:val="Heading2"/>
         <w:rPr/>
       </w:pPr>
-      <w:bookmarkStart w:id="31" w:name="__RefHeading___Toc1231_411353692"/>
+      <w:bookmarkStart w:id="31" w:name="__RefHeading___Toc1231_3379194974"/>
       <w:bookmarkEnd w:id="31"/>
       <w:r>
         <w:rPr>
@@ -12701,7 +12701,7 @@
         <w:pStyle w:val="Heading1"/>
         <w:rPr/>
       </w:pPr>
-      <w:bookmarkStart w:id="32" w:name="__RefHeading___Toc1233_411353692"/>
+      <w:bookmarkStart w:id="32" w:name="__RefHeading___Toc1233_3379194974"/>
       <w:bookmarkEnd w:id="32"/>
       <w:r>
         <w:rPr>
@@ -12715,7 +12715,7 @@
         <w:pStyle w:val="Heading2"/>
         <w:rPr/>
       </w:pPr>
-      <w:bookmarkStart w:id="33" w:name="__RefHeading___Toc1235_411353692"/>
+      <w:bookmarkStart w:id="33" w:name="__RefHeading___Toc1235_3379194974"/>
       <w:bookmarkEnd w:id="33"/>
       <w:r>
         <w:rPr>
@@ -12874,7 +12874,7 @@
         <w:pStyle w:val="Heading2"/>
         <w:rPr/>
       </w:pPr>
-      <w:bookmarkStart w:id="34" w:name="__RefHeading___Toc1237_411353692"/>
+      <w:bookmarkStart w:id="34" w:name="__RefHeading___Toc1237_3379194974"/>
       <w:bookmarkEnd w:id="34"/>
       <w:r>
         <w:rPr>

</xml_diff>

<commit_message>
Adiciona print e tabela das regras do NSG na documentação
</commit_message>
<xml_diff>
--- a/docs/Documentacao_API_Escola.docx
+++ b/docs/Documentacao_API_Escola.docx
@@ -260,7 +260,7 @@
             </w:rPr>
             <w:fldChar w:fldCharType="separate"/>
           </w:r>
-          <w:hyperlink w:anchor="__RefHeading___Toc1531_3656528421">
+          <w:hyperlink w:anchor="__RefHeading___Toc1609_1883172224">
             <w:r>
               <w:rPr>
                 <w:rStyle w:val="IndexLink"/>
@@ -280,7 +280,7 @@
             </w:tabs>
             <w:rPr/>
           </w:pPr>
-          <w:hyperlink w:anchor="__RefHeading___Toc1533_3656528421">
+          <w:hyperlink w:anchor="__RefHeading___Toc1611_1883172224">
             <w:r>
               <w:rPr>
                 <w:rStyle w:val="IndexLink"/>
@@ -300,7 +300,7 @@
             </w:tabs>
             <w:rPr/>
           </w:pPr>
-          <w:hyperlink w:anchor="__RefHeading___Toc1535_3656528421">
+          <w:hyperlink w:anchor="__RefHeading___Toc1613_1883172224">
             <w:r>
               <w:rPr>
                 <w:rStyle w:val="IndexLink"/>
@@ -320,7 +320,7 @@
             </w:tabs>
             <w:rPr/>
           </w:pPr>
-          <w:hyperlink w:anchor="__RefHeading___Toc1537_3656528421">
+          <w:hyperlink w:anchor="__RefHeading___Toc1615_1883172224">
             <w:r>
               <w:rPr>
                 <w:rStyle w:val="IndexLink"/>
@@ -340,7 +340,7 @@
             </w:tabs>
             <w:rPr/>
           </w:pPr>
-          <w:hyperlink w:anchor="__RefHeading___Toc1539_3656528421">
+          <w:hyperlink w:anchor="__RefHeading___Toc1617_1883172224">
             <w:r>
               <w:rPr>
                 <w:rStyle w:val="IndexLink"/>
@@ -360,7 +360,7 @@
             </w:tabs>
             <w:rPr/>
           </w:pPr>
-          <w:hyperlink w:anchor="__RefHeading___Toc1541_3656528421">
+          <w:hyperlink w:anchor="__RefHeading___Toc1619_1883172224">
             <w:r>
               <w:rPr>
                 <w:rStyle w:val="IndexLink"/>
@@ -380,7 +380,7 @@
             </w:tabs>
             <w:rPr/>
           </w:pPr>
-          <w:hyperlink w:anchor="__RefHeading___Toc1543_3656528421">
+          <w:hyperlink w:anchor="__RefHeading___Toc1621_1883172224">
             <w:r>
               <w:rPr>
                 <w:rStyle w:val="IndexLink"/>
@@ -400,7 +400,7 @@
             </w:tabs>
             <w:rPr/>
           </w:pPr>
-          <w:hyperlink w:anchor="__RefHeading___Toc1545_3656528421">
+          <w:hyperlink w:anchor="__RefHeading___Toc1623_1883172224">
             <w:r>
               <w:rPr>
                 <w:rStyle w:val="IndexLink"/>
@@ -420,7 +420,7 @@
             </w:tabs>
             <w:rPr/>
           </w:pPr>
-          <w:hyperlink w:anchor="__RefHeading___Toc1547_3656528421">
+          <w:hyperlink w:anchor="__RefHeading___Toc1625_1883172224">
             <w:r>
               <w:rPr>
                 <w:rStyle w:val="IndexLink"/>
@@ -440,7 +440,7 @@
             </w:tabs>
             <w:rPr/>
           </w:pPr>
-          <w:hyperlink w:anchor="__RefHeading___Toc1549_3656528421">
+          <w:hyperlink w:anchor="__RefHeading___Toc1627_1883172224">
             <w:r>
               <w:rPr>
                 <w:rStyle w:val="IndexLink"/>
@@ -460,7 +460,7 @@
             </w:tabs>
             <w:rPr/>
           </w:pPr>
-          <w:hyperlink w:anchor="__RefHeading___Toc1551_3656528421">
+          <w:hyperlink w:anchor="__RefHeading___Toc1629_1883172224">
             <w:r>
               <w:rPr>
                 <w:rStyle w:val="IndexLink"/>
@@ -480,7 +480,7 @@
             </w:tabs>
             <w:rPr/>
           </w:pPr>
-          <w:hyperlink w:anchor="__RefHeading___Toc1553_3656528421">
+          <w:hyperlink w:anchor="__RefHeading___Toc1631_1883172224">
             <w:r>
               <w:rPr>
                 <w:rStyle w:val="IndexLink"/>
@@ -500,7 +500,7 @@
             </w:tabs>
             <w:rPr/>
           </w:pPr>
-          <w:hyperlink w:anchor="__RefHeading___Toc1555_3656528421">
+          <w:hyperlink w:anchor="__RefHeading___Toc1633_1883172224">
             <w:r>
               <w:rPr>
                 <w:rStyle w:val="IndexLink"/>
@@ -520,7 +520,7 @@
             </w:tabs>
             <w:rPr/>
           </w:pPr>
-          <w:hyperlink w:anchor="__RefHeading___Toc1557_3656528421">
+          <w:hyperlink w:anchor="__RefHeading___Toc1635_1883172224">
             <w:r>
               <w:rPr>
                 <w:rStyle w:val="IndexLink"/>
@@ -540,7 +540,7 @@
             </w:tabs>
             <w:rPr/>
           </w:pPr>
-          <w:hyperlink w:anchor="__RefHeading___Toc1559_3656528421">
+          <w:hyperlink w:anchor="__RefHeading___Toc1637_1883172224">
             <w:r>
               <w:rPr>
                 <w:rStyle w:val="IndexLink"/>
@@ -560,7 +560,7 @@
             </w:tabs>
             <w:rPr/>
           </w:pPr>
-          <w:hyperlink w:anchor="__RefHeading___Toc1561_3656528421">
+          <w:hyperlink w:anchor="__RefHeading___Toc1639_1883172224">
             <w:r>
               <w:rPr>
                 <w:rStyle w:val="IndexLink"/>
@@ -580,7 +580,7 @@
             </w:tabs>
             <w:rPr/>
           </w:pPr>
-          <w:hyperlink w:anchor="__RefHeading___Toc1563_3656528421">
+          <w:hyperlink w:anchor="__RefHeading___Toc1641_1883172224">
             <w:r>
               <w:rPr>
                 <w:rStyle w:val="IndexLink"/>
@@ -600,7 +600,7 @@
             </w:tabs>
             <w:rPr/>
           </w:pPr>
-          <w:hyperlink w:anchor="__RefHeading___Toc1565_3656528421">
+          <w:hyperlink w:anchor="__RefHeading___Toc1643_1883172224">
             <w:r>
               <w:rPr>
                 <w:rStyle w:val="IndexLink"/>
@@ -620,7 +620,7 @@
             </w:tabs>
             <w:rPr/>
           </w:pPr>
-          <w:hyperlink w:anchor="__RefHeading___Toc1567_3656528421">
+          <w:hyperlink w:anchor="__RefHeading___Toc1645_1883172224">
             <w:r>
               <w:rPr>
                 <w:rStyle w:val="IndexLink"/>
@@ -640,7 +640,7 @@
             </w:tabs>
             <w:rPr/>
           </w:pPr>
-          <w:hyperlink w:anchor="__RefHeading___Toc1569_3656528421">
+          <w:hyperlink w:anchor="__RefHeading___Toc1647_1883172224">
             <w:r>
               <w:rPr>
                 <w:rStyle w:val="IndexLink"/>
@@ -660,7 +660,7 @@
             </w:tabs>
             <w:rPr/>
           </w:pPr>
-          <w:hyperlink w:anchor="__RefHeading___Toc1571_3656528421">
+          <w:hyperlink w:anchor="__RefHeading___Toc1649_1883172224">
             <w:r>
               <w:rPr>
                 <w:rStyle w:val="IndexLink"/>
@@ -680,7 +680,7 @@
             </w:tabs>
             <w:rPr/>
           </w:pPr>
-          <w:hyperlink w:anchor="__RefHeading___Toc1573_3656528421">
+          <w:hyperlink w:anchor="__RefHeading___Toc1651_1883172224">
             <w:r>
               <w:rPr>
                 <w:rStyle w:val="IndexLink"/>
@@ -700,7 +700,7 @@
             </w:tabs>
             <w:rPr/>
           </w:pPr>
-          <w:hyperlink w:anchor="__RefHeading___Toc1575_3656528421">
+          <w:hyperlink w:anchor="__RefHeading___Toc1653_1883172224">
             <w:r>
               <w:rPr>
                 <w:rStyle w:val="IndexLink"/>
@@ -720,7 +720,7 @@
             </w:tabs>
             <w:rPr/>
           </w:pPr>
-          <w:hyperlink w:anchor="__RefHeading___Toc1577_3656528421">
+          <w:hyperlink w:anchor="__RefHeading___Toc1655_1883172224">
             <w:r>
               <w:rPr>
                 <w:rStyle w:val="IndexLink"/>
@@ -740,7 +740,7 @@
             </w:tabs>
             <w:rPr/>
           </w:pPr>
-          <w:hyperlink w:anchor="__RefHeading___Toc1579_3656528421">
+          <w:hyperlink w:anchor="__RefHeading___Toc1657_1883172224">
             <w:r>
               <w:rPr>
                 <w:rStyle w:val="IndexLink"/>
@@ -760,14 +760,14 @@
             </w:tabs>
             <w:rPr/>
           </w:pPr>
-          <w:hyperlink w:anchor="__RefHeading___Toc1581_3656528421">
+          <w:hyperlink w:anchor="__RefHeading___Toc1659_1883172224">
             <w:r>
               <w:rPr>
                 <w:rStyle w:val="IndexLink"/>
               </w:rPr>
               <w:t>8. Passo a passo do deploy</w:t>
               <w:tab/>
-              <w:t>22</w:t>
+              <w:t>23</w:t>
             </w:r>
           </w:hyperlink>
         </w:p>
@@ -780,14 +780,14 @@
             </w:tabs>
             <w:rPr/>
           </w:pPr>
-          <w:hyperlink w:anchor="__RefHeading___Toc1583_3656528421">
+          <w:hyperlink w:anchor="__RefHeading___Toc1661_1883172224">
             <w:r>
               <w:rPr>
                 <w:rStyle w:val="IndexLink"/>
               </w:rPr>
               <w:t>8.1 Rodar e testar localmente</w:t>
               <w:tab/>
-              <w:t>22</w:t>
+              <w:t>23</w:t>
             </w:r>
           </w:hyperlink>
         </w:p>
@@ -800,14 +800,14 @@
             </w:tabs>
             <w:rPr/>
           </w:pPr>
-          <w:hyperlink w:anchor="__RefHeading___Toc1585_3656528421">
+          <w:hyperlink w:anchor="__RefHeading___Toc1663_1883172224">
             <w:r>
               <w:rPr>
                 <w:rStyle w:val="IndexLink"/>
               </w:rPr>
               <w:t>8.2 Publicar no GitHub</w:t>
               <w:tab/>
-              <w:t>22</w:t>
+              <w:t>23</w:t>
             </w:r>
           </w:hyperlink>
         </w:p>
@@ -820,14 +820,14 @@
             </w:tabs>
             <w:rPr/>
           </w:pPr>
-          <w:hyperlink w:anchor="__RefHeading___Toc1587_3656528421">
+          <w:hyperlink w:anchor="__RefHeading___Toc1665_1883172224">
             <w:r>
               <w:rPr>
                 <w:rStyle w:val="IndexLink"/>
               </w:rPr>
               <w:t>8.3 Criar a infraestrutura na Azure</w:t>
               <w:tab/>
-              <w:t>22</w:t>
+              <w:t>23</w:t>
             </w:r>
           </w:hyperlink>
         </w:p>
@@ -840,14 +840,14 @@
             </w:tabs>
             <w:rPr/>
           </w:pPr>
-          <w:hyperlink w:anchor="__RefHeading___Toc1589_3656528421">
+          <w:hyperlink w:anchor="__RefHeading___Toc1667_1883172224">
             <w:r>
               <w:rPr>
                 <w:rStyle w:val="IndexLink"/>
               </w:rPr>
               <w:t>8.4 Configurar a VM (quando necessário)</w:t>
               <w:tab/>
-              <w:t>22</w:t>
+              <w:t>23</w:t>
             </w:r>
           </w:hyperlink>
         </w:p>
@@ -860,14 +860,14 @@
             </w:tabs>
             <w:rPr/>
           </w:pPr>
-          <w:hyperlink w:anchor="__RefHeading___Toc1591_3656528421">
+          <w:hyperlink w:anchor="__RefHeading___Toc1669_1883172224">
             <w:r>
               <w:rPr>
                 <w:rStyle w:val="IndexLink"/>
               </w:rPr>
               <w:t>8.5 Validar e remover</w:t>
               <w:tab/>
-              <w:t>23</w:t>
+              <w:t>24</w:t>
             </w:r>
           </w:hyperlink>
         </w:p>
@@ -880,14 +880,14 @@
             </w:tabs>
             <w:rPr/>
           </w:pPr>
-          <w:hyperlink w:anchor="__RefHeading___Toc1593_3656528421">
+          <w:hyperlink w:anchor="__RefHeading___Toc1671_1883172224">
             <w:r>
               <w:rPr>
                 <w:rStyle w:val="IndexLink"/>
               </w:rPr>
               <w:t>8.6 Problemas encontrados e soluções</w:t>
               <w:tab/>
-              <w:t>23</w:t>
+              <w:t>24</w:t>
             </w:r>
           </w:hyperlink>
         </w:p>
@@ -900,14 +900,14 @@
             </w:tabs>
             <w:rPr/>
           </w:pPr>
-          <w:hyperlink w:anchor="__RefHeading___Toc1595_3656528421">
+          <w:hyperlink w:anchor="__RefHeading___Toc1673_1883172224">
             <w:r>
               <w:rPr>
                 <w:rStyle w:val="IndexLink"/>
               </w:rPr>
               <w:t>9. Repositório no GitHub</w:t>
               <w:tab/>
-              <w:t>24</w:t>
+              <w:t>25</w:t>
             </w:r>
           </w:hyperlink>
         </w:p>
@@ -920,14 +920,14 @@
             </w:tabs>
             <w:rPr/>
           </w:pPr>
-          <w:hyperlink w:anchor="__RefHeading___Toc1597_3656528421">
+          <w:hyperlink w:anchor="__RefHeading___Toc1675_1883172224">
             <w:r>
               <w:rPr>
                 <w:rStyle w:val="IndexLink"/>
               </w:rPr>
               <w:t>10. Melhorias futuras e conclusão</w:t>
               <w:tab/>
-              <w:t>25</w:t>
+              <w:t>26</w:t>
             </w:r>
           </w:hyperlink>
         </w:p>
@@ -940,14 +940,14 @@
             </w:tabs>
             <w:rPr/>
           </w:pPr>
-          <w:hyperlink w:anchor="__RefHeading___Toc1599_3656528421">
+          <w:hyperlink w:anchor="__RefHeading___Toc1677_1883172224">
             <w:r>
               <w:rPr>
                 <w:rStyle w:val="IndexLink"/>
               </w:rPr>
               <w:t>10.1 Melhorias possíveis</w:t>
               <w:tab/>
-              <w:t>25</w:t>
+              <w:t>26</w:t>
             </w:r>
           </w:hyperlink>
         </w:p>
@@ -960,14 +960,14 @@
             </w:tabs>
             <w:rPr/>
           </w:pPr>
-          <w:hyperlink w:anchor="__RefHeading___Toc1601_3656528421">
+          <w:hyperlink w:anchor="__RefHeading___Toc1679_1883172224">
             <w:r>
               <w:rPr>
                 <w:rStyle w:val="IndexLink"/>
               </w:rPr>
               <w:t>10.2 Conclusão</w:t>
               <w:tab/>
-              <w:t>25</w:t>
+              <w:t>26</w:t>
             </w:r>
           </w:hyperlink>
           <w:r>
@@ -1000,7 +1000,7 @@
         <w:pStyle w:val="Heading1"/>
         <w:rPr/>
       </w:pPr>
-      <w:bookmarkStart w:id="0" w:name="__RefHeading___Toc1531_3656528421"/>
+      <w:bookmarkStart w:id="0" w:name="__RefHeading___Toc1609_1883172224"/>
       <w:bookmarkEnd w:id="0"/>
       <w:r>
         <w:rPr>
@@ -1140,7 +1140,7 @@
         <w:pStyle w:val="Heading2"/>
         <w:rPr/>
       </w:pPr>
-      <w:bookmarkStart w:id="1" w:name="__RefHeading___Toc1533_3656528421"/>
+      <w:bookmarkStart w:id="1" w:name="__RefHeading___Toc1611_1883172224"/>
       <w:bookmarkEnd w:id="1"/>
       <w:r>
         <w:rPr>
@@ -1327,7 +1327,7 @@
         <w:pStyle w:val="Heading1"/>
         <w:rPr/>
       </w:pPr>
-      <w:bookmarkStart w:id="2" w:name="__RefHeading___Toc1535_3656528421"/>
+      <w:bookmarkStart w:id="2" w:name="__RefHeading___Toc1613_1883172224"/>
       <w:bookmarkEnd w:id="2"/>
       <w:r>
         <w:rPr>
@@ -1518,7 +1518,7 @@
         <w:pStyle w:val="Heading2"/>
         <w:rPr/>
       </w:pPr>
-      <w:bookmarkStart w:id="3" w:name="__RefHeading___Toc1537_3656528421"/>
+      <w:bookmarkStart w:id="3" w:name="__RefHeading___Toc1615_1883172224"/>
       <w:bookmarkEnd w:id="3"/>
       <w:r>
         <w:rPr>
@@ -1650,7 +1650,7 @@
         <w:pStyle w:val="Heading1"/>
         <w:rPr/>
       </w:pPr>
-      <w:bookmarkStart w:id="4" w:name="__RefHeading___Toc1539_3656528421"/>
+      <w:bookmarkStart w:id="4" w:name="__RefHeading___Toc1617_1883172224"/>
       <w:bookmarkEnd w:id="4"/>
       <w:r>
         <w:rPr>
@@ -2628,7 +2628,7 @@
         <w:pStyle w:val="Heading1"/>
         <w:rPr/>
       </w:pPr>
-      <w:bookmarkStart w:id="5" w:name="__RefHeading___Toc1541_3656528421"/>
+      <w:bookmarkStart w:id="5" w:name="__RefHeading___Toc1619_1883172224"/>
       <w:bookmarkEnd w:id="5"/>
       <w:r>
         <w:rPr>
@@ -2714,7 +2714,7 @@
         <w:pStyle w:val="Heading2"/>
         <w:rPr/>
       </w:pPr>
-      <w:bookmarkStart w:id="6" w:name="__RefHeading___Toc1543_3656528421"/>
+      <w:bookmarkStart w:id="6" w:name="__RefHeading___Toc1621_1883172224"/>
       <w:bookmarkEnd w:id="6"/>
       <w:r>
         <w:rPr>
@@ -4217,7 +4217,7 @@
         <w:pStyle w:val="Heading2"/>
         <w:rPr/>
       </w:pPr>
-      <w:bookmarkStart w:id="7" w:name="__RefHeading___Toc1545_3656528421"/>
+      <w:bookmarkStart w:id="7" w:name="__RefHeading___Toc1623_1883172224"/>
       <w:bookmarkEnd w:id="7"/>
       <w:r>
         <w:rPr>
@@ -4567,7 +4567,7 @@
         <w:pStyle w:val="Heading1"/>
         <w:rPr/>
       </w:pPr>
-      <w:bookmarkStart w:id="8" w:name="__RefHeading___Toc1547_3656528421"/>
+      <w:bookmarkStart w:id="8" w:name="__RefHeading___Toc1625_1883172224"/>
       <w:bookmarkEnd w:id="8"/>
       <w:r>
         <w:rPr>
@@ -4581,7 +4581,7 @@
         <w:pStyle w:val="Heading2"/>
         <w:rPr/>
       </w:pPr>
-      <w:bookmarkStart w:id="9" w:name="__RefHeading___Toc1549_3656528421"/>
+      <w:bookmarkStart w:id="9" w:name="__RefHeading___Toc1627_1883172224"/>
       <w:bookmarkEnd w:id="9"/>
       <w:r>
         <w:rPr>
@@ -5212,7 +5212,7 @@
         <w:pStyle w:val="Heading2"/>
         <w:rPr/>
       </w:pPr>
-      <w:bookmarkStart w:id="10" w:name="__RefHeading___Toc1551_3656528421"/>
+      <w:bookmarkStart w:id="10" w:name="__RefHeading___Toc1629_1883172224"/>
       <w:bookmarkEnd w:id="10"/>
       <w:r>
         <w:rPr>
@@ -6894,7 +6894,7 @@
         <w:pStyle w:val="Heading2"/>
         <w:rPr/>
       </w:pPr>
-      <w:bookmarkStart w:id="11" w:name="__RefHeading___Toc1553_3656528421"/>
+      <w:bookmarkStart w:id="11" w:name="__RefHeading___Toc1631_1883172224"/>
       <w:bookmarkEnd w:id="11"/>
       <w:r>
         <w:rPr>
@@ -7491,7 +7491,7 @@
         <w:pStyle w:val="Heading2"/>
         <w:rPr/>
       </w:pPr>
-      <w:bookmarkStart w:id="12" w:name="__RefHeading___Toc1555_3656528421"/>
+      <w:bookmarkStart w:id="12" w:name="__RefHeading___Toc1633_1883172224"/>
       <w:bookmarkEnd w:id="12"/>
       <w:r>
         <w:rPr>
@@ -7613,7 +7613,7 @@
         <w:pStyle w:val="Heading2"/>
         <w:rPr/>
       </w:pPr>
-      <w:bookmarkStart w:id="13" w:name="__RefHeading___Toc1557_3656528421"/>
+      <w:bookmarkStart w:id="13" w:name="__RefHeading___Toc1635_1883172224"/>
       <w:bookmarkEnd w:id="13"/>
       <w:r>
         <w:rPr>
@@ -7818,7 +7818,7 @@
         <w:pStyle w:val="Heading1"/>
         <w:rPr/>
       </w:pPr>
-      <w:bookmarkStart w:id="14" w:name="__RefHeading___Toc1559_3656528421"/>
+      <w:bookmarkStart w:id="14" w:name="__RefHeading___Toc1637_1883172224"/>
       <w:bookmarkEnd w:id="14"/>
       <w:r>
         <w:rPr>
@@ -7932,7 +7932,7 @@
         <w:pStyle w:val="Heading2"/>
         <w:rPr/>
       </w:pPr>
-      <w:bookmarkStart w:id="15" w:name="__RefHeading___Toc1561_3656528421"/>
+      <w:bookmarkStart w:id="15" w:name="__RefHeading___Toc1639_1883172224"/>
       <w:bookmarkEnd w:id="15"/>
       <w:r>
         <w:rPr>
@@ -7952,7 +7952,7 @@
         <w:rPr>
           <w:rFonts w:eastAsia="Arial" w:cs="Arial"/>
         </w:rPr>
-        <w:t>Horários no fuso de Brasília (UTC−3). Os prints de 01 a 06 foram gerados automaticamente com a API rodando localmente. Os prints de 07 a 13 foram capturados no navegador e no portal da Azure, e o horário indicado é o aproximado da captura.</w:t>
+        <w:t>Horários no fuso de Brasília (UTC−3). Os prints de 01 a 06 foram gerados automaticamente com a API rodando localmente. Os prints de 07 a 14 foram capturados no navegador e no portal da Azure, e o horário indicado é o aproximado da captura.</w:t>
       </w:r>
     </w:p>
     <w:tbl>
@@ -9410,6 +9410,109 @@
           </w:p>
         </w:tc>
       </w:tr>
+      <w:tr>
+        <w:trPr/>
+        <w:tc>
+          <w:tcPr>
+            <w:tcW w:w="799" w:type="dxa"/>
+            <w:tcBorders>
+              <w:top w:val="single" w:sz="4" w:space="0" w:color="BFBFBF"/>
+              <w:left w:val="single" w:sz="4" w:space="0" w:color="BFBFBF"/>
+              <w:bottom w:val="single" w:sz="4" w:space="0" w:color="BFBFBF"/>
+              <w:right w:val="single" w:sz="4" w:space="0" w:color="BFBFBF"/>
+            </w:tcBorders>
+            <w:shd w:color="auto" w:fill="F2F6FA" w:val="clear"/>
+          </w:tcPr>
+          <w:p>
+            <w:pPr>
+              <w:pStyle w:val="Normal"/>
+              <w:spacing w:lineRule="exact" w:line="260" w:before="0" w:after="0"/>
+              <w:rPr/>
+            </w:pPr>
+            <w:r>
+              <w:rPr>
+                <w:rFonts w:eastAsia="Arial" w:cs="Arial"/>
+              </w:rPr>
+              <w:t>14</w:t>
+            </w:r>
+          </w:p>
+        </w:tc>
+        <w:tc>
+          <w:tcPr>
+            <w:tcW w:w="3900" w:type="dxa"/>
+            <w:tcBorders>
+              <w:top w:val="single" w:sz="4" w:space="0" w:color="BFBFBF"/>
+              <w:left w:val="single" w:sz="4" w:space="0" w:color="BFBFBF"/>
+              <w:bottom w:val="single" w:sz="4" w:space="0" w:color="BFBFBF"/>
+              <w:right w:val="single" w:sz="4" w:space="0" w:color="BFBFBF"/>
+            </w:tcBorders>
+            <w:shd w:color="auto" w:fill="F2F6FA" w:val="clear"/>
+          </w:tcPr>
+          <w:p>
+            <w:pPr>
+              <w:pStyle w:val="Normal"/>
+              <w:spacing w:lineRule="exact" w:line="260" w:before="0" w:after="0"/>
+              <w:rPr/>
+            </w:pPr>
+            <w:r>
+              <w:rPr>
+                <w:rFonts w:eastAsia="Arial" w:cs="Arial"/>
+              </w:rPr>
+              <w:t>NSG – regras de segurança de entrada</w:t>
+            </w:r>
+          </w:p>
+        </w:tc>
+        <w:tc>
+          <w:tcPr>
+            <w:tcW w:w="1500" w:type="dxa"/>
+            <w:tcBorders>
+              <w:top w:val="single" w:sz="4" w:space="0" w:color="BFBFBF"/>
+              <w:left w:val="single" w:sz="4" w:space="0" w:color="BFBFBF"/>
+              <w:bottom w:val="single" w:sz="4" w:space="0" w:color="BFBFBF"/>
+              <w:right w:val="single" w:sz="4" w:space="0" w:color="BFBFBF"/>
+            </w:tcBorders>
+            <w:shd w:color="auto" w:fill="F2F6FA" w:val="clear"/>
+          </w:tcPr>
+          <w:p>
+            <w:pPr>
+              <w:pStyle w:val="Normal"/>
+              <w:spacing w:lineRule="exact" w:line="260" w:before="0" w:after="0"/>
+              <w:rPr/>
+            </w:pPr>
+            <w:r>
+              <w:rPr>
+                <w:rFonts w:eastAsia="Arial" w:cs="Arial"/>
+              </w:rPr>
+              <w:t>Portal Azure</w:t>
+            </w:r>
+          </w:p>
+        </w:tc>
+        <w:tc>
+          <w:tcPr>
+            <w:tcW w:w="2826" w:type="dxa"/>
+            <w:tcBorders>
+              <w:top w:val="single" w:sz="4" w:space="0" w:color="BFBFBF"/>
+              <w:left w:val="single" w:sz="4" w:space="0" w:color="BFBFBF"/>
+              <w:bottom w:val="single" w:sz="4" w:space="0" w:color="BFBFBF"/>
+              <w:right w:val="single" w:sz="4" w:space="0" w:color="BFBFBF"/>
+            </w:tcBorders>
+            <w:shd w:color="auto" w:fill="F2F6FA" w:val="clear"/>
+          </w:tcPr>
+          <w:p>
+            <w:pPr>
+              <w:pStyle w:val="Normal"/>
+              <w:spacing w:lineRule="exact" w:line="260" w:before="0" w:after="0"/>
+              <w:rPr/>
+            </w:pPr>
+            <w:r>
+              <w:rPr>
+                <w:rFonts w:eastAsia="Arial" w:cs="Arial"/>
+              </w:rPr>
+              <w:t>26/10/2026 ≈ 00:49</w:t>
+            </w:r>
+          </w:p>
+        </w:tc>
+      </w:tr>
     </w:tbl>
     <w:p>
       <w:pPr>
@@ -9454,7 +9557,7 @@
         <w:pStyle w:val="Heading2"/>
         <w:rPr/>
       </w:pPr>
-      <w:bookmarkStart w:id="16" w:name="__RefHeading___Toc1563_3656528421"/>
+      <w:bookmarkStart w:id="16" w:name="__RefHeading___Toc1641_1883172224"/>
       <w:bookmarkEnd w:id="16"/>
       <w:r>
         <w:rPr>
@@ -9569,7 +9672,7 @@
         <w:pStyle w:val="Heading2"/>
         <w:rPr/>
       </w:pPr>
-      <w:bookmarkStart w:id="17" w:name="__RefHeading___Toc1565_3656528421"/>
+      <w:bookmarkStart w:id="17" w:name="__RefHeading___Toc1643_1883172224"/>
       <w:bookmarkEnd w:id="17"/>
       <w:r>
         <w:rPr>
@@ -9676,7 +9779,7 @@
         <w:pStyle w:val="Heading2"/>
         <w:rPr/>
       </w:pPr>
-      <w:bookmarkStart w:id="18" w:name="__RefHeading___Toc1567_3656528421"/>
+      <w:bookmarkStart w:id="18" w:name="__RefHeading___Toc1645_1883172224"/>
       <w:bookmarkEnd w:id="18"/>
       <w:r>
         <w:rPr>
@@ -10049,7 +10152,7 @@
         <w:pStyle w:val="Heading2"/>
         <w:rPr/>
       </w:pPr>
-      <w:bookmarkStart w:id="19" w:name="__RefHeading___Toc1569_3656528421"/>
+      <w:bookmarkStart w:id="19" w:name="__RefHeading___Toc1647_1883172224"/>
       <w:bookmarkEnd w:id="19"/>
       <w:r>
         <w:rPr>
@@ -10353,7 +10456,7 @@
         <w:pStyle w:val="Heading1"/>
         <w:rPr/>
       </w:pPr>
-      <w:bookmarkStart w:id="20" w:name="__RefHeading___Toc1571_3656528421"/>
+      <w:bookmarkStart w:id="20" w:name="__RefHeading___Toc1649_1883172224"/>
       <w:bookmarkEnd w:id="20"/>
       <w:r>
         <w:rPr>
@@ -10416,7 +10519,21 @@
         <w:rPr>
           <w:rFonts w:eastAsia="Arial" w:cs="Arial"/>
         </w:rPr>
-        <w:t>. A conta usada é a conta acadêmica da FIAP. Esta seção explica cada elemento, com os valores reais do ambiente publicado.</w:t>
+        <w:t xml:space="preserve">. A conta usada é a conta acadêmica da FIAP, na assinatura </w:t>
+      </w:r>
+      <w:r>
+        <w:rPr>
+          <w:rFonts w:eastAsia="Arial" w:cs="Arial"/>
+          <w:b/>
+          <w:bCs/>
+        </w:rPr>
+        <w:t>Azure for Students</w:t>
+      </w:r>
+      <w:r>
+        <w:rPr>
+          <w:rFonts w:eastAsia="Arial" w:cs="Arial"/>
+        </w:rPr>
+        <w:t>. Esta seção explica cada elemento, com os valores reais do ambiente publicado.</w:t>
       </w:r>
     </w:p>
     <w:p>
@@ -11467,7 +11584,7 @@
         <w:pStyle w:val="Heading2"/>
         <w:rPr/>
       </w:pPr>
-      <w:bookmarkStart w:id="21" w:name="__RefHeading___Toc1573_3656528421"/>
+      <w:bookmarkStart w:id="21" w:name="__RefHeading___Toc1651_1883172224"/>
       <w:bookmarkEnd w:id="21"/>
       <w:r>
         <w:rPr>
@@ -12472,7 +12589,7 @@
         <w:pStyle w:val="Heading2"/>
         <w:rPr/>
       </w:pPr>
-      <w:bookmarkStart w:id="22" w:name="__RefHeading___Toc1575_3656528421"/>
+      <w:bookmarkStart w:id="22" w:name="__RefHeading___Toc1653_1883172224"/>
       <w:bookmarkEnd w:id="22"/>
       <w:r>
         <w:rPr>
@@ -12781,7 +12898,7 @@
         <w:pStyle w:val="Heading2"/>
         <w:rPr/>
       </w:pPr>
-      <w:bookmarkStart w:id="23" w:name="__RefHeading___Toc1577_3656528421"/>
+      <w:bookmarkStart w:id="23" w:name="__RefHeading___Toc1655_1883172224"/>
       <w:bookmarkEnd w:id="23"/>
       <w:r>
         <w:rPr>
@@ -12967,7 +13084,114 @@
         <w:rPr>
           <w:rFonts w:eastAsia="Arial" w:cs="Arial"/>
         </w:rPr>
-        <w:t>Regras de entrada do NSG, criadas pelo script:</w:t>
+        <w:t xml:space="preserve">As regras de entrada do NSG, conferidas no portal, são estas. Segundo o portal, o NSG está associado a </w:t>
+      </w:r>
+      <w:r>
+        <w:rPr>
+          <w:rFonts w:eastAsia="Arial" w:cs="Arial"/>
+          <w:b/>
+          <w:bCs/>
+        </w:rPr>
+        <w:t>1 interface de rede</w:t>
+      </w:r>
+      <w:r>
+        <w:rPr>
+          <w:rFonts w:eastAsia="Arial" w:cs="Arial"/>
+        </w:rPr>
+        <w:t xml:space="preserve"> (a da VM) e pertence à assinatura </w:t>
+      </w:r>
+      <w:r>
+        <w:rPr>
+          <w:rFonts w:eastAsia="Arial" w:cs="Arial"/>
+          <w:b/>
+          <w:bCs/>
+        </w:rPr>
+        <w:t>Azure for Students</w:t>
+      </w:r>
+      <w:r>
+        <w:rPr>
+          <w:rFonts w:eastAsia="Arial" w:cs="Arial"/>
+        </w:rPr>
+        <w:t>:</w:t>
+      </w:r>
+    </w:p>
+    <w:p>
+      <w:pPr>
+        <w:pStyle w:val="Normal"/>
+        <w:keepNext w:val="true"/>
+        <w:spacing w:before="120" w:after="60"/>
+        <w:jc w:val="center"/>
+        <w:rPr/>
+      </w:pPr>
+      <w:r>
+        <w:rPr/>
+        <w:drawing>
+          <wp:inline distT="0" distB="0" distL="0" distR="0">
+            <wp:extent cx="5715000" cy="2428875"/>
+            <wp:effectExtent l="0" t="0" r="0" b="0"/>
+            <wp:docPr id="17" name="14_azure_nsg_regras_entrada.png" descr="Regras de segurança de entrada do NSG vm-api-escolaNSG&#10;Regras de segurança de entrada do NSG vm-api-escolaNSG"/>
+            <wp:cNvGraphicFramePr>
+              <a:graphicFrameLocks xmlns:a="http://schemas.openxmlformats.org/drawingml/2006/main" noChangeAspect="1"/>
+            </wp:cNvGraphicFramePr>
+            <a:graphic xmlns:a="http://schemas.openxmlformats.org/drawingml/2006/main">
+              <a:graphicData uri="http://schemas.openxmlformats.org/drawingml/2006/picture">
+                <pic:pic xmlns:pic="http://schemas.openxmlformats.org/drawingml/2006/picture">
+                  <pic:nvPicPr>
+                    <pic:cNvPr id="17" name="14_azure_nsg_regras_entrada.png" descr="Regras de segurança de entrada do NSG vm-api-escolaNSG&#10;Regras de segurança de entrada do NSG vm-api-escolaNSG"/>
+                    <pic:cNvPicPr>
+                      <a:picLocks noChangeAspect="1" noChangeArrowheads="1"/>
+                    </pic:cNvPicPr>
+                  </pic:nvPicPr>
+                  <pic:blipFill>
+                    <a:blip r:embed="rId18"/>
+                    <a:stretch>
+                      <a:fillRect/>
+                    </a:stretch>
+                  </pic:blipFill>
+                  <pic:spPr bwMode="auto">
+                    <a:xfrm>
+                      <a:off x="0" y="0"/>
+                      <a:ext cx="5715000" cy="2428875"/>
+                    </a:xfrm>
+                    <a:prstGeom prst="rect">
+                      <a:avLst/>
+                    </a:prstGeom>
+                  </pic:spPr>
+                </pic:pic>
+              </a:graphicData>
+            </a:graphic>
+          </wp:inline>
+        </w:drawing>
+      </w:r>
+    </w:p>
+    <w:p>
+      <w:pPr>
+        <w:pStyle w:val="Normal"/>
+        <w:spacing w:before="0" w:after="240"/>
+        <w:jc w:val="center"/>
+        <w:rPr/>
+      </w:pPr>
+      <w:r>
+        <w:rPr>
+          <w:rFonts w:eastAsia="Arial" w:cs="Arial"/>
+          <w:b/>
+          <w:bCs/>
+          <w:color w:val="595959"/>
+          <w:sz w:val="18"/>
+          <w:szCs w:val="18"/>
+        </w:rPr>
+        <w:t xml:space="preserve">Figura 17 – </w:t>
+      </w:r>
+      <w:r>
+        <w:rPr>
+          <w:rFonts w:eastAsia="Arial" w:cs="Arial"/>
+          <w:i/>
+          <w:iCs/>
+          <w:color w:val="595959"/>
+          <w:sz w:val="18"/>
+          <w:szCs w:val="18"/>
+        </w:rPr>
+        <w:t>Regras de segurança de entrada do NSG vm-api-escolaNSG</w:t>
       </w:r>
     </w:p>
     <w:tbl>
@@ -12984,11 +13208,12 @@
         </w:tblCellMar>
       </w:tblPr>
       <w:tblGrid>
-        <w:gridCol w:w="1299"/>
-        <w:gridCol w:w="3101"/>
-        <w:gridCol w:w="1299"/>
-        <w:gridCol w:w="1601"/>
-        <w:gridCol w:w="1726"/>
+        <w:gridCol w:w="1250"/>
+        <w:gridCol w:w="2449"/>
+        <w:gridCol w:w="900"/>
+        <w:gridCol w:w="2150"/>
+        <w:gridCol w:w="1000"/>
+        <w:gridCol w:w="1276"/>
       </w:tblGrid>
       <w:tr>
         <w:trPr>
@@ -12996,7 +13221,7 @@
         </w:trPr>
         <w:tc>
           <w:tcPr>
-            <w:tcW w:w="1299" w:type="dxa"/>
+            <w:tcW w:w="1250" w:type="dxa"/>
             <w:tcBorders>
               <w:top w:val="single" w:sz="4" w:space="0" w:color="BFBFBF"/>
               <w:left w:val="single" w:sz="4" w:space="0" w:color="BFBFBF"/>
@@ -13026,7 +13251,7 @@
         </w:tc>
         <w:tc>
           <w:tcPr>
-            <w:tcW w:w="3101" w:type="dxa"/>
+            <w:tcW w:w="2449" w:type="dxa"/>
             <w:tcBorders>
               <w:top w:val="single" w:sz="4" w:space="0" w:color="BFBFBF"/>
               <w:left w:val="single" w:sz="4" w:space="0" w:color="BFBFBF"/>
@@ -13050,13 +13275,13 @@
                 <w:sz w:val="19"/>
                 <w:szCs w:val="19"/>
               </w:rPr>
-              <w:t>Regra NSG</w:t>
-            </w:r>
-          </w:p>
-        </w:tc>
-        <w:tc>
-          <w:tcPr>
-            <w:tcW w:w="1299" w:type="dxa"/>
+              <w:t>Regra</w:t>
+            </w:r>
+          </w:p>
+        </w:tc>
+        <w:tc>
+          <w:tcPr>
+            <w:tcW w:w="900" w:type="dxa"/>
             <w:tcBorders>
               <w:top w:val="single" w:sz="4" w:space="0" w:color="BFBFBF"/>
               <w:left w:val="single" w:sz="4" w:space="0" w:color="BFBFBF"/>
@@ -13086,7 +13311,7 @@
         </w:tc>
         <w:tc>
           <w:tcPr>
-            <w:tcW w:w="1601" w:type="dxa"/>
+            <w:tcW w:w="2150" w:type="dxa"/>
             <w:tcBorders>
               <w:top w:val="single" w:sz="4" w:space="0" w:color="BFBFBF"/>
               <w:left w:val="single" w:sz="4" w:space="0" w:color="BFBFBF"/>
@@ -13110,13 +13335,13 @@
                 <w:sz w:val="19"/>
                 <w:szCs w:val="19"/>
               </w:rPr>
-              <w:t>Origem</w:t>
-            </w:r>
-          </w:p>
-        </w:tc>
-        <w:tc>
-          <w:tcPr>
-            <w:tcW w:w="1726" w:type="dxa"/>
+              <w:t>Origem → Destino</w:t>
+            </w:r>
+          </w:p>
+        </w:tc>
+        <w:tc>
+          <w:tcPr>
+            <w:tcW w:w="1000" w:type="dxa"/>
             <w:tcBorders>
               <w:top w:val="single" w:sz="4" w:space="0" w:color="BFBFBF"/>
               <w:left w:val="single" w:sz="4" w:space="0" w:color="BFBFBF"/>
@@ -13144,12 +13369,42 @@
             </w:r>
           </w:p>
         </w:tc>
+        <w:tc>
+          <w:tcPr>
+            <w:tcW w:w="1276" w:type="dxa"/>
+            <w:tcBorders>
+              <w:top w:val="single" w:sz="4" w:space="0" w:color="BFBFBF"/>
+              <w:left w:val="single" w:sz="4" w:space="0" w:color="BFBFBF"/>
+              <w:bottom w:val="single" w:sz="4" w:space="0" w:color="BFBFBF"/>
+              <w:right w:val="single" w:sz="4" w:space="0" w:color="BFBFBF"/>
+            </w:tcBorders>
+            <w:shd w:color="auto" w:fill="1F4E79" w:val="clear"/>
+          </w:tcPr>
+          <w:p>
+            <w:pPr>
+              <w:pStyle w:val="Normal"/>
+              <w:spacing w:lineRule="exact" w:line="260" w:before="0" w:after="0"/>
+              <w:rPr/>
+            </w:pPr>
+            <w:r>
+              <w:rPr>
+                <w:rFonts w:eastAsia="Arial" w:cs="Arial"/>
+                <w:b/>
+                <w:bCs/>
+                <w:color w:val="FFFFFF"/>
+                <w:sz w:val="19"/>
+                <w:szCs w:val="19"/>
+              </w:rPr>
+              <w:t>Criada por</w:t>
+            </w:r>
+          </w:p>
+        </w:tc>
       </w:tr>
       <w:tr>
         <w:trPr/>
         <w:tc>
           <w:tcPr>
-            <w:tcW w:w="1299" w:type="dxa"/>
+            <w:tcW w:w="1250" w:type="dxa"/>
             <w:tcBorders>
               <w:top w:val="single" w:sz="4" w:space="0" w:color="BFBFBF"/>
               <w:left w:val="single" w:sz="4" w:space="0" w:color="BFBFBF"/>
@@ -13173,31 +13428,31 @@
         </w:tc>
         <w:tc>
           <w:tcPr>
-            <w:tcW w:w="3101" w:type="dxa"/>
-            <w:tcBorders>
-              <w:top w:val="single" w:sz="4" w:space="0" w:color="BFBFBF"/>
-              <w:left w:val="single" w:sz="4" w:space="0" w:color="BFBFBF"/>
-              <w:bottom w:val="single" w:sz="4" w:space="0" w:color="BFBFBF"/>
-              <w:right w:val="single" w:sz="4" w:space="0" w:color="BFBFBF"/>
-            </w:tcBorders>
-          </w:tcPr>
-          <w:p>
-            <w:pPr>
-              <w:pStyle w:val="Normal"/>
-              <w:spacing w:lineRule="exact" w:line="260" w:before="0" w:after="0"/>
-              <w:rPr/>
-            </w:pPr>
-            <w:r>
-              <w:rPr>
-                <w:rFonts w:eastAsia="Arial" w:cs="Arial"/>
-              </w:rPr>
-              <w:t>default-allow-ssh (az vm create)</w:t>
-            </w:r>
-          </w:p>
-        </w:tc>
-        <w:tc>
-          <w:tcPr>
-            <w:tcW w:w="1299" w:type="dxa"/>
+            <w:tcW w:w="2449" w:type="dxa"/>
+            <w:tcBorders>
+              <w:top w:val="single" w:sz="4" w:space="0" w:color="BFBFBF"/>
+              <w:left w:val="single" w:sz="4" w:space="0" w:color="BFBFBF"/>
+              <w:bottom w:val="single" w:sz="4" w:space="0" w:color="BFBFBF"/>
+              <w:right w:val="single" w:sz="4" w:space="0" w:color="BFBFBF"/>
+            </w:tcBorders>
+          </w:tcPr>
+          <w:p>
+            <w:pPr>
+              <w:pStyle w:val="Normal"/>
+              <w:spacing w:lineRule="exact" w:line="260" w:before="0" w:after="0"/>
+              <w:rPr/>
+            </w:pPr>
+            <w:r>
+              <w:rPr>
+                <w:rFonts w:eastAsia="Arial" w:cs="Arial"/>
+              </w:rPr>
+              <w:t>default-allow-ssh</w:t>
+            </w:r>
+          </w:p>
+        </w:tc>
+        <w:tc>
+          <w:tcPr>
+            <w:tcW w:w="900" w:type="dxa"/>
             <w:tcBorders>
               <w:top w:val="single" w:sz="4" w:space="0" w:color="BFBFBF"/>
               <w:left w:val="single" w:sz="4" w:space="0" w:color="BFBFBF"/>
@@ -13221,31 +13476,31 @@
         </w:tc>
         <w:tc>
           <w:tcPr>
-            <w:tcW w:w="1601" w:type="dxa"/>
-            <w:tcBorders>
-              <w:top w:val="single" w:sz="4" w:space="0" w:color="BFBFBF"/>
-              <w:left w:val="single" w:sz="4" w:space="0" w:color="BFBFBF"/>
-              <w:bottom w:val="single" w:sz="4" w:space="0" w:color="BFBFBF"/>
-              <w:right w:val="single" w:sz="4" w:space="0" w:color="BFBFBF"/>
-            </w:tcBorders>
-          </w:tcPr>
-          <w:p>
-            <w:pPr>
-              <w:pStyle w:val="Normal"/>
-              <w:spacing w:lineRule="exact" w:line="260" w:before="0" w:after="0"/>
-              <w:rPr/>
-            </w:pPr>
-            <w:r>
-              <w:rPr>
-                <w:rFonts w:eastAsia="Arial" w:cs="Arial"/>
-              </w:rPr>
-              <w:t>Qualquer</w:t>
-            </w:r>
-          </w:p>
-        </w:tc>
-        <w:tc>
-          <w:tcPr>
-            <w:tcW w:w="1726" w:type="dxa"/>
+            <w:tcW w:w="2150" w:type="dxa"/>
+            <w:tcBorders>
+              <w:top w:val="single" w:sz="4" w:space="0" w:color="BFBFBF"/>
+              <w:left w:val="single" w:sz="4" w:space="0" w:color="BFBFBF"/>
+              <w:bottom w:val="single" w:sz="4" w:space="0" w:color="BFBFBF"/>
+              <w:right w:val="single" w:sz="4" w:space="0" w:color="BFBFBF"/>
+            </w:tcBorders>
+          </w:tcPr>
+          <w:p>
+            <w:pPr>
+              <w:pStyle w:val="Normal"/>
+              <w:spacing w:lineRule="exact" w:line="260" w:before="0" w:after="0"/>
+              <w:rPr/>
+            </w:pPr>
+            <w:r>
+              <w:rPr>
+                <w:rFonts w:eastAsia="Arial" w:cs="Arial"/>
+              </w:rPr>
+              <w:t>Qualquer → Qualquer</w:t>
+            </w:r>
+          </w:p>
+        </w:tc>
+        <w:tc>
+          <w:tcPr>
+            <w:tcW w:w="1000" w:type="dxa"/>
             <w:tcBorders>
               <w:top w:val="single" w:sz="4" w:space="0" w:color="BFBFBF"/>
               <w:left w:val="single" w:sz="4" w:space="0" w:color="BFBFBF"/>
@@ -13264,6 +13519,30 @@
                 <w:rFonts w:eastAsia="Arial" w:cs="Arial"/>
               </w:rPr>
               <w:t>Permitir</w:t>
+            </w:r>
+          </w:p>
+        </w:tc>
+        <w:tc>
+          <w:tcPr>
+            <w:tcW w:w="1276" w:type="dxa"/>
+            <w:tcBorders>
+              <w:top w:val="single" w:sz="4" w:space="0" w:color="BFBFBF"/>
+              <w:left w:val="single" w:sz="4" w:space="0" w:color="BFBFBF"/>
+              <w:bottom w:val="single" w:sz="4" w:space="0" w:color="BFBFBF"/>
+              <w:right w:val="single" w:sz="4" w:space="0" w:color="BFBFBF"/>
+            </w:tcBorders>
+          </w:tcPr>
+          <w:p>
+            <w:pPr>
+              <w:pStyle w:val="Normal"/>
+              <w:spacing w:lineRule="exact" w:line="260" w:before="0" w:after="0"/>
+              <w:rPr/>
+            </w:pPr>
+            <w:r>
+              <w:rPr>
+                <w:rFonts w:eastAsia="Arial" w:cs="Arial"/>
+              </w:rPr>
+              <w:t>az vm create</w:t>
             </w:r>
           </w:p>
         </w:tc>
@@ -13272,7 +13551,7 @@
         <w:trPr/>
         <w:tc>
           <w:tcPr>
-            <w:tcW w:w="1299" w:type="dxa"/>
+            <w:tcW w:w="1250" w:type="dxa"/>
             <w:tcBorders>
               <w:top w:val="single" w:sz="4" w:space="0" w:color="BFBFBF"/>
               <w:left w:val="single" w:sz="4" w:space="0" w:color="BFBFBF"/>
@@ -13297,7 +13576,7 @@
         </w:tc>
         <w:tc>
           <w:tcPr>
-            <w:tcW w:w="3101" w:type="dxa"/>
+            <w:tcW w:w="2449" w:type="dxa"/>
             <w:tcBorders>
               <w:top w:val="single" w:sz="4" w:space="0" w:color="BFBFBF"/>
               <w:left w:val="single" w:sz="4" w:space="0" w:color="BFBFBF"/>
@@ -13316,13 +13595,13 @@
               <w:rPr>
                 <w:rFonts w:eastAsia="Arial" w:cs="Arial"/>
               </w:rPr>
-              <w:t>open-port-80 (az vm open-port)</w:t>
-            </w:r>
-          </w:p>
-        </w:tc>
-        <w:tc>
-          <w:tcPr>
-            <w:tcW w:w="1299" w:type="dxa"/>
+              <w:t>open-port-80</w:t>
+            </w:r>
+          </w:p>
+        </w:tc>
+        <w:tc>
+          <w:tcPr>
+            <w:tcW w:w="900" w:type="dxa"/>
             <w:tcBorders>
               <w:top w:val="single" w:sz="4" w:space="0" w:color="BFBFBF"/>
               <w:left w:val="single" w:sz="4" w:space="0" w:color="BFBFBF"/>
@@ -13341,13 +13620,13 @@
               <w:rPr>
                 <w:rFonts w:eastAsia="Arial" w:cs="Arial"/>
               </w:rPr>
-              <w:t>80/TCP</w:t>
-            </w:r>
-          </w:p>
-        </w:tc>
-        <w:tc>
-          <w:tcPr>
-            <w:tcW w:w="1601" w:type="dxa"/>
+              <w:t>80</w:t>
+            </w:r>
+          </w:p>
+        </w:tc>
+        <w:tc>
+          <w:tcPr>
+            <w:tcW w:w="2150" w:type="dxa"/>
             <w:tcBorders>
               <w:top w:val="single" w:sz="4" w:space="0" w:color="BFBFBF"/>
               <w:left w:val="single" w:sz="4" w:space="0" w:color="BFBFBF"/>
@@ -13366,13 +13645,13 @@
               <w:rPr>
                 <w:rFonts w:eastAsia="Arial" w:cs="Arial"/>
               </w:rPr>
-              <w:t>Qualquer</w:t>
-            </w:r>
-          </w:p>
-        </w:tc>
-        <w:tc>
-          <w:tcPr>
-            <w:tcW w:w="1726" w:type="dxa"/>
+              <w:t>Qualquer → Qualquer</w:t>
+            </w:r>
+          </w:p>
+        </w:tc>
+        <w:tc>
+          <w:tcPr>
+            <w:tcW w:w="1000" w:type="dxa"/>
             <w:tcBorders>
               <w:top w:val="single" w:sz="4" w:space="0" w:color="BFBFBF"/>
               <w:left w:val="single" w:sz="4" w:space="0" w:color="BFBFBF"/>
@@ -13392,6 +13671,31 @@
                 <w:rFonts w:eastAsia="Arial" w:cs="Arial"/>
               </w:rPr>
               <w:t>Permitir</w:t>
+            </w:r>
+          </w:p>
+        </w:tc>
+        <w:tc>
+          <w:tcPr>
+            <w:tcW w:w="1276" w:type="dxa"/>
+            <w:tcBorders>
+              <w:top w:val="single" w:sz="4" w:space="0" w:color="BFBFBF"/>
+              <w:left w:val="single" w:sz="4" w:space="0" w:color="BFBFBF"/>
+              <w:bottom w:val="single" w:sz="4" w:space="0" w:color="BFBFBF"/>
+              <w:right w:val="single" w:sz="4" w:space="0" w:color="BFBFBF"/>
+            </w:tcBorders>
+            <w:shd w:color="auto" w:fill="F2F6FA" w:val="clear"/>
+          </w:tcPr>
+          <w:p>
+            <w:pPr>
+              <w:pStyle w:val="Normal"/>
+              <w:spacing w:lineRule="exact" w:line="260" w:before="0" w:after="0"/>
+              <w:rPr/>
+            </w:pPr>
+            <w:r>
+              <w:rPr>
+                <w:rFonts w:eastAsia="Arial" w:cs="Arial"/>
+              </w:rPr>
+              <w:t>az vm open-port</w:t>
             </w:r>
           </w:p>
         </w:tc>
@@ -13400,7 +13704,307 @@
         <w:trPr/>
         <w:tc>
           <w:tcPr>
-            <w:tcW w:w="1299" w:type="dxa"/>
+            <w:tcW w:w="1250" w:type="dxa"/>
+            <w:tcBorders>
+              <w:top w:val="single" w:sz="4" w:space="0" w:color="BFBFBF"/>
+              <w:left w:val="single" w:sz="4" w:space="0" w:color="BFBFBF"/>
+              <w:bottom w:val="single" w:sz="4" w:space="0" w:color="BFBFBF"/>
+              <w:right w:val="single" w:sz="4" w:space="0" w:color="BFBFBF"/>
+            </w:tcBorders>
+          </w:tcPr>
+          <w:p>
+            <w:pPr>
+              <w:pStyle w:val="Normal"/>
+              <w:spacing w:lineRule="exact" w:line="260" w:before="0" w:after="0"/>
+              <w:rPr/>
+            </w:pPr>
+            <w:r>
+              <w:rPr>
+                <w:rFonts w:eastAsia="Arial" w:cs="Arial"/>
+              </w:rPr>
+              <w:t>65000</w:t>
+            </w:r>
+          </w:p>
+        </w:tc>
+        <w:tc>
+          <w:tcPr>
+            <w:tcW w:w="2449" w:type="dxa"/>
+            <w:tcBorders>
+              <w:top w:val="single" w:sz="4" w:space="0" w:color="BFBFBF"/>
+              <w:left w:val="single" w:sz="4" w:space="0" w:color="BFBFBF"/>
+              <w:bottom w:val="single" w:sz="4" w:space="0" w:color="BFBFBF"/>
+              <w:right w:val="single" w:sz="4" w:space="0" w:color="BFBFBF"/>
+            </w:tcBorders>
+          </w:tcPr>
+          <w:p>
+            <w:pPr>
+              <w:pStyle w:val="Normal"/>
+              <w:spacing w:lineRule="exact" w:line="260" w:before="0" w:after="0"/>
+              <w:rPr/>
+            </w:pPr>
+            <w:r>
+              <w:rPr>
+                <w:rFonts w:eastAsia="Arial" w:cs="Arial"/>
+              </w:rPr>
+              <w:t>AllowVnetInBound</w:t>
+            </w:r>
+          </w:p>
+        </w:tc>
+        <w:tc>
+          <w:tcPr>
+            <w:tcW w:w="900" w:type="dxa"/>
+            <w:tcBorders>
+              <w:top w:val="single" w:sz="4" w:space="0" w:color="BFBFBF"/>
+              <w:left w:val="single" w:sz="4" w:space="0" w:color="BFBFBF"/>
+              <w:bottom w:val="single" w:sz="4" w:space="0" w:color="BFBFBF"/>
+              <w:right w:val="single" w:sz="4" w:space="0" w:color="BFBFBF"/>
+            </w:tcBorders>
+          </w:tcPr>
+          <w:p>
+            <w:pPr>
+              <w:pStyle w:val="Normal"/>
+              <w:spacing w:lineRule="exact" w:line="260" w:before="0" w:after="0"/>
+              <w:rPr/>
+            </w:pPr>
+            <w:r>
+              <w:rPr>
+                <w:rFonts w:eastAsia="Arial" w:cs="Arial"/>
+              </w:rPr>
+              <w:t>Todas</w:t>
+            </w:r>
+          </w:p>
+        </w:tc>
+        <w:tc>
+          <w:tcPr>
+            <w:tcW w:w="2150" w:type="dxa"/>
+            <w:tcBorders>
+              <w:top w:val="single" w:sz="4" w:space="0" w:color="BFBFBF"/>
+              <w:left w:val="single" w:sz="4" w:space="0" w:color="BFBFBF"/>
+              <w:bottom w:val="single" w:sz="4" w:space="0" w:color="BFBFBF"/>
+              <w:right w:val="single" w:sz="4" w:space="0" w:color="BFBFBF"/>
+            </w:tcBorders>
+          </w:tcPr>
+          <w:p>
+            <w:pPr>
+              <w:pStyle w:val="Normal"/>
+              <w:spacing w:lineRule="exact" w:line="260" w:before="0" w:after="0"/>
+              <w:rPr/>
+            </w:pPr>
+            <w:r>
+              <w:rPr>
+                <w:rFonts w:eastAsia="Arial" w:cs="Arial"/>
+              </w:rPr>
+              <w:t>VirtualNetwork → VirtualNetwork</w:t>
+            </w:r>
+          </w:p>
+        </w:tc>
+        <w:tc>
+          <w:tcPr>
+            <w:tcW w:w="1000" w:type="dxa"/>
+            <w:tcBorders>
+              <w:top w:val="single" w:sz="4" w:space="0" w:color="BFBFBF"/>
+              <w:left w:val="single" w:sz="4" w:space="0" w:color="BFBFBF"/>
+              <w:bottom w:val="single" w:sz="4" w:space="0" w:color="BFBFBF"/>
+              <w:right w:val="single" w:sz="4" w:space="0" w:color="BFBFBF"/>
+            </w:tcBorders>
+          </w:tcPr>
+          <w:p>
+            <w:pPr>
+              <w:pStyle w:val="Normal"/>
+              <w:spacing w:lineRule="exact" w:line="260" w:before="0" w:after="0"/>
+              <w:rPr/>
+            </w:pPr>
+            <w:r>
+              <w:rPr>
+                <w:rFonts w:eastAsia="Arial" w:cs="Arial"/>
+              </w:rPr>
+              <w:t>Permitir</w:t>
+            </w:r>
+          </w:p>
+        </w:tc>
+        <w:tc>
+          <w:tcPr>
+            <w:tcW w:w="1276" w:type="dxa"/>
+            <w:tcBorders>
+              <w:top w:val="single" w:sz="4" w:space="0" w:color="BFBFBF"/>
+              <w:left w:val="single" w:sz="4" w:space="0" w:color="BFBFBF"/>
+              <w:bottom w:val="single" w:sz="4" w:space="0" w:color="BFBFBF"/>
+              <w:right w:val="single" w:sz="4" w:space="0" w:color="BFBFBF"/>
+            </w:tcBorders>
+          </w:tcPr>
+          <w:p>
+            <w:pPr>
+              <w:pStyle w:val="Normal"/>
+              <w:spacing w:lineRule="exact" w:line="260" w:before="0" w:after="0"/>
+              <w:rPr/>
+            </w:pPr>
+            <w:r>
+              <w:rPr>
+                <w:rFonts w:eastAsia="Arial" w:cs="Arial"/>
+              </w:rPr>
+              <w:t>Padrão da Azure</w:t>
+            </w:r>
+          </w:p>
+        </w:tc>
+      </w:tr>
+      <w:tr>
+        <w:trPr/>
+        <w:tc>
+          <w:tcPr>
+            <w:tcW w:w="1250" w:type="dxa"/>
+            <w:tcBorders>
+              <w:top w:val="single" w:sz="4" w:space="0" w:color="BFBFBF"/>
+              <w:left w:val="single" w:sz="4" w:space="0" w:color="BFBFBF"/>
+              <w:bottom w:val="single" w:sz="4" w:space="0" w:color="BFBFBF"/>
+              <w:right w:val="single" w:sz="4" w:space="0" w:color="BFBFBF"/>
+            </w:tcBorders>
+            <w:shd w:color="auto" w:fill="F2F6FA" w:val="clear"/>
+          </w:tcPr>
+          <w:p>
+            <w:pPr>
+              <w:pStyle w:val="Normal"/>
+              <w:spacing w:lineRule="exact" w:line="260" w:before="0" w:after="0"/>
+              <w:rPr/>
+            </w:pPr>
+            <w:r>
+              <w:rPr>
+                <w:rFonts w:eastAsia="Arial" w:cs="Arial"/>
+              </w:rPr>
+              <w:t>65001</w:t>
+            </w:r>
+          </w:p>
+        </w:tc>
+        <w:tc>
+          <w:tcPr>
+            <w:tcW w:w="2449" w:type="dxa"/>
+            <w:tcBorders>
+              <w:top w:val="single" w:sz="4" w:space="0" w:color="BFBFBF"/>
+              <w:left w:val="single" w:sz="4" w:space="0" w:color="BFBFBF"/>
+              <w:bottom w:val="single" w:sz="4" w:space="0" w:color="BFBFBF"/>
+              <w:right w:val="single" w:sz="4" w:space="0" w:color="BFBFBF"/>
+            </w:tcBorders>
+            <w:shd w:color="auto" w:fill="F2F6FA" w:val="clear"/>
+          </w:tcPr>
+          <w:p>
+            <w:pPr>
+              <w:pStyle w:val="Normal"/>
+              <w:spacing w:lineRule="exact" w:line="260" w:before="0" w:after="0"/>
+              <w:rPr/>
+            </w:pPr>
+            <w:r>
+              <w:rPr>
+                <w:rFonts w:eastAsia="Arial" w:cs="Arial"/>
+              </w:rPr>
+              <w:t>AllowAzureLoadBalancerInBound</w:t>
+            </w:r>
+          </w:p>
+        </w:tc>
+        <w:tc>
+          <w:tcPr>
+            <w:tcW w:w="900" w:type="dxa"/>
+            <w:tcBorders>
+              <w:top w:val="single" w:sz="4" w:space="0" w:color="BFBFBF"/>
+              <w:left w:val="single" w:sz="4" w:space="0" w:color="BFBFBF"/>
+              <w:bottom w:val="single" w:sz="4" w:space="0" w:color="BFBFBF"/>
+              <w:right w:val="single" w:sz="4" w:space="0" w:color="BFBFBF"/>
+            </w:tcBorders>
+            <w:shd w:color="auto" w:fill="F2F6FA" w:val="clear"/>
+          </w:tcPr>
+          <w:p>
+            <w:pPr>
+              <w:pStyle w:val="Normal"/>
+              <w:spacing w:lineRule="exact" w:line="260" w:before="0" w:after="0"/>
+              <w:rPr/>
+            </w:pPr>
+            <w:r>
+              <w:rPr>
+                <w:rFonts w:eastAsia="Arial" w:cs="Arial"/>
+              </w:rPr>
+              <w:t>Todas</w:t>
+            </w:r>
+          </w:p>
+        </w:tc>
+        <w:tc>
+          <w:tcPr>
+            <w:tcW w:w="2150" w:type="dxa"/>
+            <w:tcBorders>
+              <w:top w:val="single" w:sz="4" w:space="0" w:color="BFBFBF"/>
+              <w:left w:val="single" w:sz="4" w:space="0" w:color="BFBFBF"/>
+              <w:bottom w:val="single" w:sz="4" w:space="0" w:color="BFBFBF"/>
+              <w:right w:val="single" w:sz="4" w:space="0" w:color="BFBFBF"/>
+            </w:tcBorders>
+            <w:shd w:color="auto" w:fill="F2F6FA" w:val="clear"/>
+          </w:tcPr>
+          <w:p>
+            <w:pPr>
+              <w:pStyle w:val="Normal"/>
+              <w:spacing w:lineRule="exact" w:line="260" w:before="0" w:after="0"/>
+              <w:rPr/>
+            </w:pPr>
+            <w:r>
+              <w:rPr>
+                <w:rFonts w:eastAsia="Arial" w:cs="Arial"/>
+              </w:rPr>
+              <w:t>AzureLoadBalancer → Qualquer</w:t>
+            </w:r>
+          </w:p>
+        </w:tc>
+        <w:tc>
+          <w:tcPr>
+            <w:tcW w:w="1000" w:type="dxa"/>
+            <w:tcBorders>
+              <w:top w:val="single" w:sz="4" w:space="0" w:color="BFBFBF"/>
+              <w:left w:val="single" w:sz="4" w:space="0" w:color="BFBFBF"/>
+              <w:bottom w:val="single" w:sz="4" w:space="0" w:color="BFBFBF"/>
+              <w:right w:val="single" w:sz="4" w:space="0" w:color="BFBFBF"/>
+            </w:tcBorders>
+            <w:shd w:color="auto" w:fill="F2F6FA" w:val="clear"/>
+          </w:tcPr>
+          <w:p>
+            <w:pPr>
+              <w:pStyle w:val="Normal"/>
+              <w:spacing w:lineRule="exact" w:line="260" w:before="0" w:after="0"/>
+              <w:rPr/>
+            </w:pPr>
+            <w:r>
+              <w:rPr>
+                <w:rFonts w:eastAsia="Arial" w:cs="Arial"/>
+              </w:rPr>
+              <w:t>Permitir</w:t>
+            </w:r>
+          </w:p>
+        </w:tc>
+        <w:tc>
+          <w:tcPr>
+            <w:tcW w:w="1276" w:type="dxa"/>
+            <w:tcBorders>
+              <w:top w:val="single" w:sz="4" w:space="0" w:color="BFBFBF"/>
+              <w:left w:val="single" w:sz="4" w:space="0" w:color="BFBFBF"/>
+              <w:bottom w:val="single" w:sz="4" w:space="0" w:color="BFBFBF"/>
+              <w:right w:val="single" w:sz="4" w:space="0" w:color="BFBFBF"/>
+            </w:tcBorders>
+            <w:shd w:color="auto" w:fill="F2F6FA" w:val="clear"/>
+          </w:tcPr>
+          <w:p>
+            <w:pPr>
+              <w:pStyle w:val="Normal"/>
+              <w:spacing w:lineRule="exact" w:line="260" w:before="0" w:after="0"/>
+              <w:rPr/>
+            </w:pPr>
+            <w:r>
+              <w:rPr>
+                <w:rFonts w:eastAsia="Arial" w:cs="Arial"/>
+              </w:rPr>
+              <w:t>Padrão da Azure</w:t>
+            </w:r>
+          </w:p>
+        </w:tc>
+      </w:tr>
+      <w:tr>
+        <w:trPr/>
+        <w:tc>
+          <w:tcPr>
+            <w:tcW w:w="1250" w:type="dxa"/>
             <w:tcBorders>
               <w:top w:val="single" w:sz="4" w:space="0" w:color="BFBFBF"/>
               <w:left w:val="single" w:sz="4" w:space="0" w:color="BFBFBF"/>
@@ -13424,31 +14028,31 @@
         </w:tc>
         <w:tc>
           <w:tcPr>
-            <w:tcW w:w="3101" w:type="dxa"/>
-            <w:tcBorders>
-              <w:top w:val="single" w:sz="4" w:space="0" w:color="BFBFBF"/>
-              <w:left w:val="single" w:sz="4" w:space="0" w:color="BFBFBF"/>
-              <w:bottom w:val="single" w:sz="4" w:space="0" w:color="BFBFBF"/>
-              <w:right w:val="single" w:sz="4" w:space="0" w:color="BFBFBF"/>
-            </w:tcBorders>
-          </w:tcPr>
-          <w:p>
-            <w:pPr>
-              <w:pStyle w:val="Normal"/>
-              <w:spacing w:lineRule="exact" w:line="260" w:before="0" w:after="0"/>
-              <w:rPr/>
-            </w:pPr>
-            <w:r>
-              <w:rPr>
-                <w:rFonts w:eastAsia="Arial" w:cs="Arial"/>
-              </w:rPr>
-              <w:t>DenyAllInBound (padrão)</w:t>
-            </w:r>
-          </w:p>
-        </w:tc>
-        <w:tc>
-          <w:tcPr>
-            <w:tcW w:w="1299" w:type="dxa"/>
+            <w:tcW w:w="2449" w:type="dxa"/>
+            <w:tcBorders>
+              <w:top w:val="single" w:sz="4" w:space="0" w:color="BFBFBF"/>
+              <w:left w:val="single" w:sz="4" w:space="0" w:color="BFBFBF"/>
+              <w:bottom w:val="single" w:sz="4" w:space="0" w:color="BFBFBF"/>
+              <w:right w:val="single" w:sz="4" w:space="0" w:color="BFBFBF"/>
+            </w:tcBorders>
+          </w:tcPr>
+          <w:p>
+            <w:pPr>
+              <w:pStyle w:val="Normal"/>
+              <w:spacing w:lineRule="exact" w:line="260" w:before="0" w:after="0"/>
+              <w:rPr/>
+            </w:pPr>
+            <w:r>
+              <w:rPr>
+                <w:rFonts w:eastAsia="Arial" w:cs="Arial"/>
+              </w:rPr>
+              <w:t>DenyAllInBound</w:t>
+            </w:r>
+          </w:p>
+        </w:tc>
+        <w:tc>
+          <w:tcPr>
+            <w:tcW w:w="900" w:type="dxa"/>
             <w:tcBorders>
               <w:top w:val="single" w:sz="4" w:space="0" w:color="BFBFBF"/>
               <w:left w:val="single" w:sz="4" w:space="0" w:color="BFBFBF"/>
@@ -13472,31 +14076,31 @@
         </w:tc>
         <w:tc>
           <w:tcPr>
-            <w:tcW w:w="1601" w:type="dxa"/>
-            <w:tcBorders>
-              <w:top w:val="single" w:sz="4" w:space="0" w:color="BFBFBF"/>
-              <w:left w:val="single" w:sz="4" w:space="0" w:color="BFBFBF"/>
-              <w:bottom w:val="single" w:sz="4" w:space="0" w:color="BFBFBF"/>
-              <w:right w:val="single" w:sz="4" w:space="0" w:color="BFBFBF"/>
-            </w:tcBorders>
-          </w:tcPr>
-          <w:p>
-            <w:pPr>
-              <w:pStyle w:val="Normal"/>
-              <w:spacing w:lineRule="exact" w:line="260" w:before="0" w:after="0"/>
-              <w:rPr/>
-            </w:pPr>
-            <w:r>
-              <w:rPr>
-                <w:rFonts w:eastAsia="Arial" w:cs="Arial"/>
-              </w:rPr>
-              <w:t>Qualquer</w:t>
-            </w:r>
-          </w:p>
-        </w:tc>
-        <w:tc>
-          <w:tcPr>
-            <w:tcW w:w="1726" w:type="dxa"/>
+            <w:tcW w:w="2150" w:type="dxa"/>
+            <w:tcBorders>
+              <w:top w:val="single" w:sz="4" w:space="0" w:color="BFBFBF"/>
+              <w:left w:val="single" w:sz="4" w:space="0" w:color="BFBFBF"/>
+              <w:bottom w:val="single" w:sz="4" w:space="0" w:color="BFBFBF"/>
+              <w:right w:val="single" w:sz="4" w:space="0" w:color="BFBFBF"/>
+            </w:tcBorders>
+          </w:tcPr>
+          <w:p>
+            <w:pPr>
+              <w:pStyle w:val="Normal"/>
+              <w:spacing w:lineRule="exact" w:line="260" w:before="0" w:after="0"/>
+              <w:rPr/>
+            </w:pPr>
+            <w:r>
+              <w:rPr>
+                <w:rFonts w:eastAsia="Arial" w:cs="Arial"/>
+              </w:rPr>
+              <w:t>Qualquer → Qualquer</w:t>
+            </w:r>
+          </w:p>
+        </w:tc>
+        <w:tc>
+          <w:tcPr>
+            <w:tcW w:w="1000" w:type="dxa"/>
             <w:tcBorders>
               <w:top w:val="single" w:sz="4" w:space="0" w:color="BFBFBF"/>
               <w:left w:val="single" w:sz="4" w:space="0" w:color="BFBFBF"/>
@@ -13515,6 +14119,30 @@
                 <w:rFonts w:eastAsia="Arial" w:cs="Arial"/>
               </w:rPr>
               <w:t>Negar</w:t>
+            </w:r>
+          </w:p>
+        </w:tc>
+        <w:tc>
+          <w:tcPr>
+            <w:tcW w:w="1276" w:type="dxa"/>
+            <w:tcBorders>
+              <w:top w:val="single" w:sz="4" w:space="0" w:color="BFBFBF"/>
+              <w:left w:val="single" w:sz="4" w:space="0" w:color="BFBFBF"/>
+              <w:bottom w:val="single" w:sz="4" w:space="0" w:color="BFBFBF"/>
+              <w:right w:val="single" w:sz="4" w:space="0" w:color="BFBFBF"/>
+            </w:tcBorders>
+          </w:tcPr>
+          <w:p>
+            <w:pPr>
+              <w:pStyle w:val="Normal"/>
+              <w:spacing w:lineRule="exact" w:line="260" w:before="0" w:after="0"/>
+              <w:rPr/>
+            </w:pPr>
+            <w:r>
+              <w:rPr>
+                <w:rFonts w:eastAsia="Arial" w:cs="Arial"/>
+              </w:rPr>
+              <w:t>Padrão da Azure</w:t>
             </w:r>
           </w:p>
         </w:tc>
@@ -13528,6 +14156,62 @@
       </w:pPr>
       <w:r>
         <w:rPr/>
+      </w:r>
+    </w:p>
+    <w:p>
+      <w:pPr>
+        <w:pStyle w:val="Normal"/>
+        <w:spacing w:lineRule="exact" w:line="300" w:before="0" w:after="120"/>
+        <w:jc w:val="both"/>
+        <w:rPr/>
+      </w:pPr>
+      <w:r>
+        <w:rPr>
+          <w:rFonts w:eastAsia="Arial" w:cs="Arial"/>
+        </w:rPr>
+        <w:t xml:space="preserve">As regras são avaliadas da </w:t>
+      </w:r>
+      <w:r>
+        <w:rPr>
+          <w:rFonts w:eastAsia="Arial" w:cs="Arial"/>
+          <w:b/>
+          <w:bCs/>
+        </w:rPr>
+        <w:t>menor para a maior prioridade</w:t>
+      </w:r>
+      <w:r>
+        <w:rPr>
+          <w:rFonts w:eastAsia="Arial" w:cs="Arial"/>
+        </w:rPr>
+        <w:t xml:space="preserve">, e a primeira que combinar com o tráfego decide. Assim, as portas 22 e 80 são liberadas antes de chegar à regra 65500, que </w:t>
+      </w:r>
+      <w:r>
+        <w:rPr>
+          <w:rFonts w:eastAsia="Arial" w:cs="Arial"/>
+          <w:b/>
+          <w:bCs/>
+        </w:rPr>
+        <w:t>bloqueia todo o resto</w:t>
+      </w:r>
+      <w:r>
+        <w:rPr>
+          <w:rFonts w:eastAsia="Arial" w:cs="Arial"/>
+        </w:rPr>
+        <w:t xml:space="preserve">. O portal mostra um </w:t>
+      </w:r>
+      <w:r>
+        <w:rPr>
+          <w:rFonts w:eastAsia="Arial" w:cs="Arial"/>
+          <w:b/>
+          <w:bCs/>
+        </w:rPr>
+        <w:t>ícone de alerta</w:t>
+      </w:r>
+      <w:r>
+        <w:rPr>
+          <w:rFonts w:eastAsia="Arial" w:cs="Arial"/>
+        </w:rPr>
+        <w:t xml:space="preserve"> na regra SSH porque ela está aberta para qualquer origem da internet.</w:t>
       </w:r>
     </w:p>
     <w:p>
@@ -13645,7 +14329,7 @@
         <w:rPr>
           <w:rFonts w:eastAsia="Arial" w:cs="Arial"/>
         </w:rPr>
-        <w:t xml:space="preserve"> restringir a regra SSH ao IP do administrador e adicionar HTTPS (Let's Encrypt) com um nome DNS.</w:t>
+        <w:t xml:space="preserve"> restringir a regra SSH ao IP do administrador, o que também remove o alerta do portal, e adicionar HTTPS (Let's Encrypt) com um nome DNS.</w:t>
       </w:r>
     </w:p>
     <w:p>
@@ -13653,7 +14337,7 @@
         <w:pStyle w:val="Heading2"/>
         <w:rPr/>
       </w:pPr>
-      <w:bookmarkStart w:id="24" w:name="__RefHeading___Toc1579_3656528421"/>
+      <w:bookmarkStart w:id="24" w:name="__RefHeading___Toc1657_1883172224"/>
       <w:bookmarkEnd w:id="24"/>
       <w:r>
         <w:rPr>
@@ -14384,7 +15068,7 @@
         <w:pStyle w:val="Heading1"/>
         <w:rPr/>
       </w:pPr>
-      <w:bookmarkStart w:id="25" w:name="__RefHeading___Toc1581_3656528421"/>
+      <w:bookmarkStart w:id="25" w:name="__RefHeading___Toc1659_1883172224"/>
       <w:bookmarkEnd w:id="25"/>
       <w:r>
         <w:rPr>
@@ -14407,7 +15091,7 @@
           <wp:inline distT="0" distB="0" distL="0" distR="0">
             <wp:extent cx="5715000" cy="1447800"/>
             <wp:effectExtent l="0" t="0" r="0" b="0"/>
-            <wp:docPr id="17" name="fluxo_deploy.png" descr="Fluxo completo: do código à API publicada&#10;Fluxo completo: do código à API publicada"/>
+            <wp:docPr id="18" name="fluxo_deploy.png" descr="Fluxo completo: do código à API publicada&#10;Fluxo completo: do código à API publicada"/>
             <wp:cNvGraphicFramePr>
               <a:graphicFrameLocks xmlns:a="http://schemas.openxmlformats.org/drawingml/2006/main" noChangeAspect="1"/>
             </wp:cNvGraphicFramePr>
@@ -14415,13 +15099,13 @@
               <a:graphicData uri="http://schemas.openxmlformats.org/drawingml/2006/picture">
                 <pic:pic xmlns:pic="http://schemas.openxmlformats.org/drawingml/2006/picture">
                   <pic:nvPicPr>
-                    <pic:cNvPr id="17" name="fluxo_deploy.png" descr="Fluxo completo: do código à API publicada&#10;Fluxo completo: do código à API publicada"/>
+                    <pic:cNvPr id="18" name="fluxo_deploy.png" descr="Fluxo completo: do código à API publicada&#10;Fluxo completo: do código à API publicada"/>
                     <pic:cNvPicPr>
                       <a:picLocks noChangeAspect="1" noChangeArrowheads="1"/>
                     </pic:cNvPicPr>
                   </pic:nvPicPr>
                   <pic:blipFill>
-                    <a:blip r:embed="rId18"/>
+                    <a:blip r:embed="rId19"/>
                     <a:stretch>
                       <a:fillRect/>
                     </a:stretch>
@@ -14458,7 +15142,7 @@
           <w:sz w:val="18"/>
           <w:szCs w:val="18"/>
         </w:rPr>
-        <w:t xml:space="preserve">Figura 17 – </w:t>
+        <w:t xml:space="preserve">Figura 18 – </w:t>
       </w:r>
       <w:r>
         <w:rPr>
@@ -14477,7 +15161,7 @@
         <w:pStyle w:val="Heading2"/>
         <w:rPr/>
       </w:pPr>
-      <w:bookmarkStart w:id="26" w:name="__RefHeading___Toc1583_3656528421"/>
+      <w:bookmarkStart w:id="26" w:name="__RefHeading___Toc1661_1883172224"/>
       <w:bookmarkEnd w:id="26"/>
       <w:r>
         <w:rPr>
@@ -14629,7 +15313,7 @@
         <w:pStyle w:val="Heading2"/>
         <w:rPr/>
       </w:pPr>
-      <w:bookmarkStart w:id="27" w:name="__RefHeading___Toc1585_3656528421"/>
+      <w:bookmarkStart w:id="27" w:name="__RefHeading___Toc1663_1883172224"/>
       <w:bookmarkEnd w:id="27"/>
       <w:r>
         <w:rPr>
@@ -14717,7 +15401,7 @@
         <w:pStyle w:val="Heading2"/>
         <w:rPr/>
       </w:pPr>
-      <w:bookmarkStart w:id="28" w:name="__RefHeading___Toc1587_3656528421"/>
+      <w:bookmarkStart w:id="28" w:name="__RefHeading___Toc1665_1883172224"/>
       <w:bookmarkEnd w:id="28"/>
       <w:r>
         <w:rPr>
@@ -14885,7 +15569,7 @@
         <w:pStyle w:val="Heading2"/>
         <w:rPr/>
       </w:pPr>
-      <w:bookmarkStart w:id="29" w:name="__RefHeading___Toc1589_3656528421"/>
+      <w:bookmarkStart w:id="29" w:name="__RefHeading___Toc1667_1883172224"/>
       <w:bookmarkEnd w:id="29"/>
       <w:r>
         <w:rPr>
@@ -15059,7 +15743,7 @@
         <w:pStyle w:val="Heading2"/>
         <w:rPr/>
       </w:pPr>
-      <w:bookmarkStart w:id="30" w:name="__RefHeading___Toc1591_3656528421"/>
+      <w:bookmarkStart w:id="30" w:name="__RefHeading___Toc1669_1883172224"/>
       <w:bookmarkEnd w:id="30"/>
       <w:r>
         <w:rPr>
@@ -15188,7 +15872,7 @@
         <w:pStyle w:val="Heading2"/>
         <w:rPr/>
       </w:pPr>
-      <w:bookmarkStart w:id="31" w:name="__RefHeading___Toc1593_3656528421"/>
+      <w:bookmarkStart w:id="31" w:name="__RefHeading___Toc1671_1883172224"/>
       <w:bookmarkEnd w:id="31"/>
       <w:r>
         <w:rPr>
@@ -15823,7 +16507,7 @@
         <w:pStyle w:val="Heading1"/>
         <w:rPr/>
       </w:pPr>
-      <w:bookmarkStart w:id="32" w:name="__RefHeading___Toc1595_3656528421"/>
+      <w:bookmarkStart w:id="32" w:name="__RefHeading___Toc1673_1883172224"/>
       <w:bookmarkEnd w:id="32"/>
       <w:r>
         <w:rPr>
@@ -15846,7 +16530,7 @@
         </w:rPr>
         <w:t xml:space="preserve">Repositório: </w:t>
       </w:r>
-      <w:hyperlink r:id="rId19">
+      <w:hyperlink r:id="rId20">
         <w:r>
           <w:rPr>
             <w:rStyle w:val="Hyperlink"/>
@@ -15870,7 +16554,7 @@
         </w:rPr>
         <w:t xml:space="preserve">API publicada: </w:t>
       </w:r>
-      <w:hyperlink r:id="rId20">
+      <w:hyperlink r:id="rId21">
         <w:r>
           <w:rPr>
             <w:rStyle w:val="Hyperlink"/>
@@ -15951,7 +16635,7 @@
         <w:rPr>
           <w:rFonts w:eastAsia="Arial" w:cs="Arial"/>
         </w:rPr>
-        <w:t xml:space="preserve"> com os diagramas, os 13 prints e este documento em Word e PDF.</w:t>
+        <w:t xml:space="preserve"> com os diagramas, os 14 prints e este documento em Word e PDF.</w:t>
       </w:r>
     </w:p>
     <w:p>
@@ -16198,7 +16882,7 @@
           <w:sz w:val="17"/>
           <w:szCs w:val="17"/>
         </w:rPr>
-        <w:t>prints/             # 13 prints (local e Azure)</w:t>
+        <w:t>prints/             # 14 prints (local e Azure)</w:t>
       </w:r>
     </w:p>
     <w:p>
@@ -16273,7 +16957,7 @@
         <w:pStyle w:val="Heading1"/>
         <w:rPr/>
       </w:pPr>
-      <w:bookmarkStart w:id="33" w:name="__RefHeading___Toc1597_3656528421"/>
+      <w:bookmarkStart w:id="33" w:name="__RefHeading___Toc1675_1883172224"/>
       <w:bookmarkEnd w:id="33"/>
       <w:r>
         <w:rPr>
@@ -16287,7 +16971,7 @@
         <w:pStyle w:val="Heading2"/>
         <w:rPr/>
       </w:pPr>
-      <w:bookmarkStart w:id="34" w:name="__RefHeading___Toc1599_3656528421"/>
+      <w:bookmarkStart w:id="34" w:name="__RefHeading___Toc1677_1883172224"/>
       <w:bookmarkEnd w:id="34"/>
       <w:r>
         <w:rPr>
@@ -16446,7 +17130,7 @@
         <w:pStyle w:val="Heading2"/>
         <w:rPr/>
       </w:pPr>
-      <w:bookmarkStart w:id="35" w:name="__RefHeading___Toc1601_3656528421"/>
+      <w:bookmarkStart w:id="35" w:name="__RefHeading___Toc1679_1883172224"/>
       <w:bookmarkEnd w:id="35"/>
       <w:r>
         <w:rPr>
@@ -16512,12 +17196,12 @@
       </w:r>
     </w:p>
     <w:sectPr>
-      <w:headerReference w:type="even" r:id="rId21"/>
-      <w:headerReference w:type="default" r:id="rId22"/>
-      <w:headerReference w:type="first" r:id="rId23"/>
-      <w:footerReference w:type="even" r:id="rId24"/>
-      <w:footerReference w:type="default" r:id="rId25"/>
-      <w:footerReference w:type="first" r:id="rId26"/>
+      <w:headerReference w:type="even" r:id="rId22"/>
+      <w:headerReference w:type="default" r:id="rId23"/>
+      <w:headerReference w:type="first" r:id="rId24"/>
+      <w:footerReference w:type="even" r:id="rId25"/>
+      <w:footerReference w:type="default" r:id="rId26"/>
+      <w:footerReference w:type="first" r:id="rId27"/>
       <w:type w:val="nextPage"/>
       <w:pgSz w:w="11906" w:h="16838"/>
       <w:pgMar w:left="1440" w:right="1440" w:gutter="0" w:header="708" w:top="1440" w:footer="708" w:bottom="1440"/>
@@ -16576,7 +17260,7 @@
     </w:r>
     <w:r>
       <w:rPr/>
-      <w:t>25</w:t>
+      <w:t>26</w:t>
     </w:r>
     <w:r>
       <w:rPr/>

</xml_diff>